<commit_message>
update tasks more easy
</commit_message>
<xml_diff>
--- a/Лабораторные/Лабораторная работа 3.docx
+++ b/Лабораторные/Лабораторная работа 3.docx
@@ -1,6 +1,6 @@
 
 <file path=word/document.xml><?xml version="1.0" encoding="utf-8"?>
-<w:document xmlns:wpc="http://schemas.microsoft.com/office/word/2010/wordprocessingCanvas" xmlns:cx="http://schemas.microsoft.com/office/drawing/2014/chartex" xmlns:mc="http://schemas.openxmlformats.org/markup-compatibility/2006" xmlns:o="urn:schemas-microsoft-com:office:office" xmlns:r="http://schemas.openxmlformats.org/officeDocument/2006/relationships" xmlns:m="http://schemas.openxmlformats.org/officeDocument/2006/math" xmlns:v="urn:schemas-microsoft-com:vml" xmlns:wp14="http://schemas.microsoft.com/office/word/2010/wordprocessingDrawing" xmlns:wp="http://schemas.openxmlformats.org/drawingml/2006/wordprocessingDrawing" xmlns:w10="urn:schemas-microsoft-com:office:word" xmlns:w="http://schemas.openxmlformats.org/wordprocessingml/2006/main" xmlns:w14="http://schemas.microsoft.com/office/word/2010/wordml" xmlns:w15="http://schemas.microsoft.com/office/word/2012/wordml" xmlns:w16se="http://schemas.microsoft.com/office/word/2015/wordml/symex" xmlns:wpg="http://schemas.microsoft.com/office/word/2010/wordprocessingGroup" xmlns:wpi="http://schemas.microsoft.com/office/word/2010/wordprocessingInk" xmlns:wne="http://schemas.microsoft.com/office/word/2006/wordml" xmlns:wps="http://schemas.microsoft.com/office/word/2010/wordprocessingShape" mc:Ignorable="w14 w15 w16se wp14">
+<w:document xmlns:wpc="http://schemas.microsoft.com/office/word/2010/wordprocessingCanvas" xmlns:mc="http://schemas.openxmlformats.org/markup-compatibility/2006" xmlns:o="urn:schemas-microsoft-com:office:office" xmlns:r="http://schemas.openxmlformats.org/officeDocument/2006/relationships" xmlns:m="http://schemas.openxmlformats.org/officeDocument/2006/math" xmlns:v="urn:schemas-microsoft-com:vml" xmlns:wp14="http://schemas.microsoft.com/office/word/2010/wordprocessingDrawing" xmlns:wp="http://schemas.openxmlformats.org/drawingml/2006/wordprocessingDrawing" xmlns:w10="urn:schemas-microsoft-com:office:word" xmlns:w="http://schemas.openxmlformats.org/wordprocessingml/2006/main" xmlns:w14="http://schemas.microsoft.com/office/word/2010/wordml" xmlns:w15="http://schemas.microsoft.com/office/word/2012/wordml" xmlns:wpg="http://schemas.microsoft.com/office/word/2010/wordprocessingGroup" xmlns:wpi="http://schemas.microsoft.com/office/word/2010/wordprocessingInk" xmlns:wne="http://schemas.microsoft.com/office/word/2006/wordml" xmlns:wps="http://schemas.microsoft.com/office/word/2010/wordprocessingShape" mc:Ignorable="w14 w15 wp14">
   <w:body>
     <w:p>
       <w:pPr>
@@ -74,8 +74,6 @@
           <w:szCs w:val="22"/>
         </w:rPr>
       </w:pPr>
-      <w:bookmarkStart w:id="1" w:name="_GoBack"/>
-      <w:bookmarkEnd w:id="1"/>
     </w:p>
     <w:p>
       <w:pPr>
@@ -588,6 +586,7 @@
         </w:rPr>
         <w:t xml:space="preserve"> = </w:t>
       </w:r>
+      <w:proofErr w:type="gramStart"/>
       <w:r>
         <w:rPr>
           <w:rFonts w:ascii="Consolas" w:hAnsi="Consolas"/>
@@ -604,7 +603,17 @@
           <w:sz w:val="18"/>
           <w:szCs w:val="21"/>
         </w:rPr>
-        <w:t>();</w:t>
+        <w:t>(</w:t>
+      </w:r>
+      <w:proofErr w:type="gramEnd"/>
+      <w:r>
+        <w:rPr>
+          <w:rFonts w:ascii="Consolas" w:hAnsi="Consolas"/>
+          <w:color w:val="222222"/>
+          <w:sz w:val="18"/>
+          <w:szCs w:val="21"/>
+        </w:rPr>
+        <w:t>);</w:t>
       </w:r>
       <w:r>
         <w:rPr>
@@ -874,6 +883,7 @@
         </w:rPr>
         <w:t xml:space="preserve"> </w:t>
       </w:r>
+      <w:proofErr w:type="gramStart"/>
       <w:r>
         <w:rPr>
           <w:rFonts w:ascii="Consolas" w:hAnsi="Consolas"/>
@@ -890,7 +900,17 @@
           <w:sz w:val="18"/>
           <w:szCs w:val="21"/>
         </w:rPr>
-        <w:t>()</w:t>
+        <w:t>(</w:t>
+      </w:r>
+      <w:proofErr w:type="gramEnd"/>
+      <w:r>
+        <w:rPr>
+          <w:rFonts w:ascii="Consolas" w:hAnsi="Consolas"/>
+          <w:color w:val="222222"/>
+          <w:sz w:val="18"/>
+          <w:szCs w:val="21"/>
+        </w:rPr>
+        <w:t>)</w:t>
       </w:r>
     </w:p>
     <w:p>
@@ -904,6 +924,7 @@
           <w:color w:val="000000"/>
           <w:sz w:val="18"/>
           <w:szCs w:val="21"/>
+          <w:lang w:val="en-US"/>
         </w:rPr>
       </w:pPr>
       <w:r>
@@ -912,6 +933,7 @@
           <w:color w:val="222222"/>
           <w:sz w:val="18"/>
           <w:szCs w:val="21"/>
+          <w:lang w:val="en-US"/>
         </w:rPr>
         <w:t>{</w:t>
       </w:r>
@@ -936,6 +958,7 @@
           <w:color w:val="222222"/>
           <w:sz w:val="18"/>
           <w:szCs w:val="21"/>
+          <w:lang w:val="en-US"/>
         </w:rPr>
         <w:lastRenderedPageBreak/>
         <w:t xml:space="preserve"> </w:t>
@@ -946,6 +969,7 @@
           <w:color w:val="222222"/>
           <w:sz w:val="18"/>
           <w:szCs w:val="21"/>
+          <w:lang w:val="en-US"/>
         </w:rPr>
         <w:t xml:space="preserve"> </w:t>
       </w:r>
@@ -955,6 +979,7 @@
           <w:color w:val="222222"/>
           <w:sz w:val="18"/>
           <w:szCs w:val="21"/>
+          <w:lang w:val="en-US"/>
         </w:rPr>
         <w:t xml:space="preserve"> </w:t>
       </w:r>
@@ -964,6 +989,7 @@
           <w:color w:val="222222"/>
           <w:sz w:val="18"/>
           <w:szCs w:val="21"/>
+          <w:lang w:val="en-US"/>
         </w:rPr>
         <w:t xml:space="preserve"> </w:t>
       </w:r>
@@ -1032,6 +1058,7 @@
         </w:rPr>
         <w:t xml:space="preserve"> </w:t>
       </w:r>
+      <w:proofErr w:type="gramStart"/>
       <w:r>
         <w:rPr>
           <w:rFonts w:ascii="Consolas" w:hAnsi="Consolas"/>
@@ -1072,6 +1099,7 @@
         </w:rPr>
         <w:t>(</w:t>
       </w:r>
+      <w:proofErr w:type="gramEnd"/>
       <w:r>
         <w:rPr>
           <w:rFonts w:ascii="Consolas" w:hAnsi="Consolas"/>
@@ -1185,6 +1213,7 @@
         </w:rPr>
         <w:t xml:space="preserve"> </w:t>
       </w:r>
+      <w:proofErr w:type="gramStart"/>
       <w:r>
         <w:rPr>
           <w:rFonts w:ascii="Consolas" w:hAnsi="Consolas"/>
@@ -1195,6 +1224,7 @@
         </w:rPr>
         <w:t>await</w:t>
       </w:r>
+      <w:proofErr w:type="gramEnd"/>
       <w:r>
         <w:rPr>
           <w:rFonts w:ascii="Consolas" w:hAnsi="Consolas"/>
@@ -1368,6 +1398,7 @@
         </w:rPr>
         <w:t xml:space="preserve"> </w:t>
       </w:r>
+      <w:proofErr w:type="gramStart"/>
       <w:r>
         <w:rPr>
           <w:rFonts w:ascii="Consolas" w:hAnsi="Consolas"/>
@@ -1408,6 +1439,7 @@
         </w:rPr>
         <w:t>(</w:t>
       </w:r>
+      <w:proofErr w:type="gramEnd"/>
       <w:r>
         <w:rPr>
           <w:rFonts w:ascii="Consolas" w:hAnsi="Consolas"/>
@@ -1526,6 +1558,7 @@
           <w:lang w:val="en-US"/>
         </w:rPr>
       </w:pPr>
+      <w:proofErr w:type="gramStart"/>
       <w:r>
         <w:rPr>
           <w:rFonts w:ascii="Consolas" w:hAnsi="Consolas"/>
@@ -1536,6 +1569,7 @@
         </w:rPr>
         <w:t>void</w:t>
       </w:r>
+      <w:proofErr w:type="gramEnd"/>
       <w:r>
         <w:rPr>
           <w:rFonts w:ascii="Consolas" w:hAnsi="Consolas"/>
@@ -1606,6 +1640,7 @@
           <w:lang w:val="en-US"/>
         </w:rPr>
       </w:pPr>
+      <w:proofErr w:type="gramStart"/>
       <w:r>
         <w:rPr>
           <w:rFonts w:ascii="Consolas" w:hAnsi="Consolas"/>
@@ -1646,6 +1681,7 @@
         </w:rPr>
         <w:t>(</w:t>
       </w:r>
+      <w:proofErr w:type="gramEnd"/>
       <w:r>
         <w:rPr>
           <w:rFonts w:ascii="Consolas" w:hAnsi="Consolas"/>
@@ -1681,6 +1717,7 @@
           <w:lang w:val="en-US"/>
         </w:rPr>
       </w:pPr>
+      <w:proofErr w:type="gramStart"/>
       <w:r>
         <w:rPr>
           <w:rFonts w:ascii="Consolas" w:hAnsi="Consolas"/>
@@ -1721,6 +1758,7 @@
         </w:rPr>
         <w:t>(</w:t>
       </w:r>
+      <w:proofErr w:type="gramEnd"/>
     </w:p>
     <w:p>
       <w:pPr>
@@ -1888,6 +1926,7 @@
           <w:lang w:val="en-US"/>
         </w:rPr>
       </w:pPr>
+      <w:proofErr w:type="gramStart"/>
       <w:r>
         <w:rPr>
           <w:rFonts w:ascii="Consolas" w:hAnsi="Consolas"/>
@@ -1898,6 +1937,7 @@
         </w:rPr>
         <w:t>var</w:t>
       </w:r>
+      <w:proofErr w:type="gramEnd"/>
       <w:r>
         <w:rPr>
           <w:rFonts w:ascii="Consolas" w:hAnsi="Consolas"/>
@@ -2050,6 +2090,7 @@
           <w:lang w:val="en-US"/>
         </w:rPr>
       </w:pPr>
+      <w:proofErr w:type="gramStart"/>
       <w:r>
         <w:rPr>
           <w:rFonts w:ascii="Consolas" w:hAnsi="Consolas"/>
@@ -2060,6 +2101,7 @@
         </w:rPr>
         <w:t>var</w:t>
       </w:r>
+      <w:proofErr w:type="gramEnd"/>
       <w:r>
         <w:rPr>
           <w:rFonts w:ascii="Consolas" w:hAnsi="Consolas"/>
@@ -2212,6 +2254,7 @@
           <w:lang w:val="en-US"/>
         </w:rPr>
       </w:pPr>
+      <w:proofErr w:type="gramStart"/>
       <w:r>
         <w:rPr>
           <w:rFonts w:ascii="Consolas" w:hAnsi="Consolas"/>
@@ -2222,6 +2265,7 @@
         </w:rPr>
         <w:t>var</w:t>
       </w:r>
+      <w:proofErr w:type="gramEnd"/>
       <w:r>
         <w:rPr>
           <w:rFonts w:ascii="Consolas" w:hAnsi="Consolas"/>
@@ -2601,6 +2645,7 @@
           <w:lang w:val="en-US"/>
         </w:rPr>
       </w:pPr>
+      <w:proofErr w:type="gramStart"/>
       <w:r>
         <w:rPr>
           <w:rFonts w:ascii="Consolas" w:hAnsi="Consolas"/>
@@ -2611,6 +2656,7 @@
         </w:rPr>
         <w:t>async</w:t>
       </w:r>
+      <w:proofErr w:type="gramEnd"/>
       <w:r>
         <w:rPr>
           <w:rFonts w:ascii="Consolas" w:hAnsi="Consolas"/>
@@ -2837,6 +2883,7 @@
         </w:rPr>
         <w:t>3000</w:t>
       </w:r>
+      <w:proofErr w:type="gramStart"/>
       <w:r>
         <w:rPr>
           <w:rFonts w:ascii="Consolas" w:hAnsi="Consolas"/>
@@ -2873,6 +2920,7 @@
         </w:rPr>
         <w:t xml:space="preserve"> </w:t>
       </w:r>
+      <w:proofErr w:type="gramEnd"/>
       <w:r>
         <w:rPr>
           <w:rFonts w:ascii="Consolas" w:hAnsi="Consolas"/>
@@ -3357,6 +3405,7 @@
         </w:rPr>
         <w:t xml:space="preserve"> </w:t>
       </w:r>
+      <w:proofErr w:type="gramStart"/>
       <w:r>
         <w:rPr>
           <w:rFonts w:ascii="Consolas" w:hAnsi="Consolas"/>
@@ -3367,6 +3416,7 @@
         </w:rPr>
         <w:t>await</w:t>
       </w:r>
+      <w:proofErr w:type="gramEnd"/>
       <w:r>
         <w:rPr>
           <w:rFonts w:ascii="Consolas" w:hAnsi="Consolas"/>
@@ -3492,6 +3542,7 @@
         </w:rPr>
         <w:t xml:space="preserve"> </w:t>
       </w:r>
+      <w:proofErr w:type="gramStart"/>
       <w:r>
         <w:rPr>
           <w:rFonts w:ascii="Consolas" w:hAnsi="Consolas"/>
@@ -3532,6 +3583,7 @@
         </w:rPr>
         <w:t>(</w:t>
       </w:r>
+      <w:proofErr w:type="gramEnd"/>
       <w:r>
         <w:rPr>
           <w:rFonts w:ascii="Consolas" w:hAnsi="Consolas"/>
@@ -3592,6 +3644,7 @@
           <w:lang w:val="en-US"/>
         </w:rPr>
       </w:pPr>
+      <w:proofErr w:type="gramStart"/>
       <w:r>
         <w:rPr>
           <w:rFonts w:ascii="Consolas" w:hAnsi="Consolas"/>
@@ -3602,6 +3655,7 @@
         </w:rPr>
         <w:t>var</w:t>
       </w:r>
+      <w:proofErr w:type="gramEnd"/>
       <w:r>
         <w:rPr>
           <w:rFonts w:ascii="Consolas" w:hAnsi="Consolas"/>
@@ -4051,6 +4105,7 @@
           <w:szCs w:val="21"/>
         </w:rPr>
       </w:pPr>
+      <w:proofErr w:type="gramStart"/>
       <w:r>
         <w:rPr>
           <w:rFonts w:ascii="Consolas" w:hAnsi="Consolas"/>
@@ -4069,6 +4124,7 @@
         </w:rPr>
         <w:t>(</w:t>
       </w:r>
+      <w:proofErr w:type="gramEnd"/>
       <w:r>
         <w:rPr>
           <w:rFonts w:ascii="Consolas" w:hAnsi="Consolas"/>
@@ -4101,6 +4157,7 @@
           <w:szCs w:val="21"/>
         </w:rPr>
       </w:pPr>
+      <w:proofErr w:type="gramStart"/>
       <w:r>
         <w:rPr>
           <w:rFonts w:ascii="Consolas" w:hAnsi="Consolas"/>
@@ -4119,6 +4176,7 @@
         </w:rPr>
         <w:t>(</w:t>
       </w:r>
+      <w:proofErr w:type="gramEnd"/>
       <w:r>
         <w:rPr>
           <w:rFonts w:ascii="Consolas" w:hAnsi="Consolas"/>
@@ -4358,9 +4416,9 @@
           <w:color w:val="000000"/>
           <w:sz w:val="18"/>
           <w:szCs w:val="21"/>
-          <w:lang w:val="en-US"/>
-        </w:rPr>
-      </w:pPr>
+        </w:rPr>
+      </w:pPr>
+      <w:proofErr w:type="gramStart"/>
       <w:r>
         <w:rPr>
           <w:rFonts w:ascii="Consolas" w:hAnsi="Consolas"/>
@@ -4371,13 +4429,13 @@
         </w:rPr>
         <w:t>async</w:t>
       </w:r>
-      <w:r>
-        <w:rPr>
-          <w:rFonts w:ascii="Consolas" w:hAnsi="Consolas"/>
-          <w:color w:val="000000"/>
-          <w:sz w:val="18"/>
-          <w:szCs w:val="21"/>
-          <w:lang w:val="en-US"/>
+      <w:proofErr w:type="gramEnd"/>
+      <w:r>
+        <w:rPr>
+          <w:rFonts w:ascii="Consolas" w:hAnsi="Consolas"/>
+          <w:color w:val="000000"/>
+          <w:sz w:val="18"/>
+          <w:szCs w:val="21"/>
         </w:rPr>
         <w:t xml:space="preserve"> </w:t>
       </w:r>
@@ -4397,7 +4455,6 @@
           <w:color w:val="000000"/>
           <w:sz w:val="18"/>
           <w:szCs w:val="21"/>
-          <w:lang w:val="en-US"/>
         </w:rPr>
         <w:t xml:space="preserve"> </w:t>
       </w:r>
@@ -4417,7 +4474,6 @@
           <w:color w:val="222222"/>
           <w:sz w:val="18"/>
           <w:szCs w:val="21"/>
-          <w:lang w:val="en-US"/>
         </w:rPr>
         <w:t>(</w:t>
       </w:r>
@@ -4437,7 +4493,6 @@
           <w:color w:val="000000"/>
           <w:sz w:val="18"/>
           <w:szCs w:val="21"/>
-          <w:lang w:val="en-US"/>
         </w:rPr>
         <w:t xml:space="preserve"> </w:t>
       </w:r>
@@ -4457,7 +4512,6 @@
           <w:color w:val="222222"/>
           <w:sz w:val="18"/>
           <w:szCs w:val="21"/>
-          <w:lang w:val="en-US"/>
         </w:rPr>
         <w:t>)</w:t>
       </w:r>
@@ -4597,6 +4651,7 @@
         </w:rPr>
         <w:t>1000</w:t>
       </w:r>
+      <w:proofErr w:type="gramStart"/>
       <w:r>
         <w:rPr>
           <w:rFonts w:ascii="Consolas" w:hAnsi="Consolas"/>
@@ -4633,6 +4688,7 @@
         </w:rPr>
         <w:t xml:space="preserve"> </w:t>
       </w:r>
+      <w:proofErr w:type="gramEnd"/>
       <w:r>
         <w:rPr>
           <w:rFonts w:ascii="Consolas" w:hAnsi="Consolas"/>
@@ -4711,6 +4767,7 @@
         </w:rPr>
         <w:t xml:space="preserve"> </w:t>
       </w:r>
+      <w:proofErr w:type="gramStart"/>
       <w:r>
         <w:rPr>
           <w:rFonts w:ascii="Consolas" w:hAnsi="Consolas"/>
@@ -4751,6 +4808,7 @@
         </w:rPr>
         <w:t>(</w:t>
       </w:r>
+      <w:proofErr w:type="gramEnd"/>
       <w:r>
         <w:rPr>
           <w:rFonts w:ascii="Consolas" w:hAnsi="Consolas"/>
@@ -4883,6 +4941,7 @@
           <w:lang w:val="en-US"/>
         </w:rPr>
       </w:pPr>
+      <w:proofErr w:type="gramStart"/>
       <w:r>
         <w:rPr>
           <w:rFonts w:ascii="Consolas" w:hAnsi="Consolas"/>
@@ -4893,6 +4952,7 @@
         </w:rPr>
         <w:t>var</w:t>
       </w:r>
+      <w:proofErr w:type="gramEnd"/>
       <w:r>
         <w:rPr>
           <w:rFonts w:ascii="Consolas" w:hAnsi="Consolas"/>
@@ -5016,6 +5076,7 @@
           <w:lang w:val="en-US"/>
         </w:rPr>
       </w:pPr>
+      <w:proofErr w:type="gramStart"/>
       <w:r>
         <w:rPr>
           <w:rFonts w:ascii="Consolas" w:hAnsi="Consolas"/>
@@ -5026,6 +5087,7 @@
         </w:rPr>
         <w:t>var</w:t>
       </w:r>
+      <w:proofErr w:type="gramEnd"/>
       <w:r>
         <w:rPr>
           <w:rFonts w:ascii="Consolas" w:hAnsi="Consolas"/>
@@ -5149,6 +5211,7 @@
           <w:lang w:val="en-US"/>
         </w:rPr>
       </w:pPr>
+      <w:proofErr w:type="gramStart"/>
       <w:r>
         <w:rPr>
           <w:rFonts w:ascii="Consolas" w:hAnsi="Consolas"/>
@@ -5159,6 +5222,7 @@
         </w:rPr>
         <w:t>await</w:t>
       </w:r>
+      <w:proofErr w:type="gramEnd"/>
       <w:r>
         <w:rPr>
           <w:rFonts w:ascii="Consolas" w:hAnsi="Consolas"/>
@@ -5204,6 +5268,7 @@
           <w:lang w:val="en-US"/>
         </w:rPr>
       </w:pPr>
+      <w:proofErr w:type="gramStart"/>
       <w:r>
         <w:rPr>
           <w:rFonts w:ascii="Consolas" w:hAnsi="Consolas"/>
@@ -5214,6 +5279,7 @@
         </w:rPr>
         <w:t>await</w:t>
       </w:r>
+      <w:proofErr w:type="gramEnd"/>
       <w:r>
         <w:rPr>
           <w:rFonts w:ascii="Consolas" w:hAnsi="Consolas"/>
@@ -5331,6 +5397,7 @@
           <w:lang w:val="en-US"/>
         </w:rPr>
       </w:pPr>
+      <w:proofErr w:type="gramStart"/>
       <w:r>
         <w:rPr>
           <w:rFonts w:ascii="Consolas" w:hAnsi="Consolas"/>
@@ -5341,6 +5408,7 @@
         </w:rPr>
         <w:t>async</w:t>
       </w:r>
+      <w:proofErr w:type="gramEnd"/>
       <w:r>
         <w:rPr>
           <w:rFonts w:ascii="Consolas" w:hAnsi="Consolas"/>
@@ -5567,6 +5635,7 @@
         </w:rPr>
         <w:t>1000</w:t>
       </w:r>
+      <w:proofErr w:type="gramStart"/>
       <w:r>
         <w:rPr>
           <w:rFonts w:ascii="Consolas" w:hAnsi="Consolas"/>
@@ -5603,6 +5672,7 @@
         </w:rPr>
         <w:t xml:space="preserve"> </w:t>
       </w:r>
+      <w:proofErr w:type="gramEnd"/>
       <w:r>
         <w:rPr>
           <w:rFonts w:ascii="Consolas" w:hAnsi="Consolas"/>
@@ -5681,6 +5751,7 @@
         </w:rPr>
         <w:t xml:space="preserve"> </w:t>
       </w:r>
+      <w:proofErr w:type="gramStart"/>
       <w:r>
         <w:rPr>
           <w:rFonts w:ascii="Consolas" w:hAnsi="Consolas"/>
@@ -5721,6 +5792,7 @@
         </w:rPr>
         <w:t>(</w:t>
       </w:r>
+      <w:proofErr w:type="gramEnd"/>
       <w:r>
         <w:rPr>
           <w:rFonts w:ascii="Consolas" w:hAnsi="Consolas"/>
@@ -5853,6 +5925,7 @@
           <w:lang w:val="en-US"/>
         </w:rPr>
       </w:pPr>
+      <w:proofErr w:type="gramStart"/>
       <w:r>
         <w:rPr>
           <w:rFonts w:ascii="Consolas" w:hAnsi="Consolas"/>
@@ -5863,6 +5936,7 @@
         </w:rPr>
         <w:t>var</w:t>
       </w:r>
+      <w:proofErr w:type="gramEnd"/>
       <w:r>
         <w:rPr>
           <w:rFonts w:ascii="Consolas" w:hAnsi="Consolas"/>
@@ -5948,6 +6022,7 @@
           <w:lang w:val="en-US"/>
         </w:rPr>
       </w:pPr>
+      <w:proofErr w:type="gramStart"/>
       <w:r>
         <w:rPr>
           <w:rFonts w:ascii="Consolas" w:hAnsi="Consolas"/>
@@ -5958,6 +6033,7 @@
         </w:rPr>
         <w:t>var</w:t>
       </w:r>
+      <w:proofErr w:type="gramEnd"/>
       <w:r>
         <w:rPr>
           <w:rFonts w:ascii="Consolas" w:hAnsi="Consolas"/>
@@ -6111,6 +6187,7 @@
           <w:lang w:val="en-US"/>
         </w:rPr>
       </w:pPr>
+      <w:proofErr w:type="gramStart"/>
       <w:r>
         <w:rPr>
           <w:rFonts w:ascii="Consolas" w:hAnsi="Consolas"/>
@@ -6121,6 +6198,7 @@
         </w:rPr>
         <w:t>int</w:t>
       </w:r>
+      <w:proofErr w:type="gramEnd"/>
       <w:r>
         <w:rPr>
           <w:rFonts w:ascii="Consolas" w:hAnsi="Consolas"/>
@@ -6206,6 +6284,7 @@
           <w:lang w:val="en-US"/>
         </w:rPr>
       </w:pPr>
+      <w:proofErr w:type="gramStart"/>
       <w:r>
         <w:rPr>
           <w:rFonts w:ascii="Consolas" w:hAnsi="Consolas"/>
@@ -6216,6 +6295,7 @@
         </w:rPr>
         <w:t>int</w:t>
       </w:r>
+      <w:proofErr w:type="gramEnd"/>
       <w:r>
         <w:rPr>
           <w:rFonts w:ascii="Consolas" w:hAnsi="Consolas"/>
@@ -6301,6 +6381,7 @@
           <w:lang w:val="en-US"/>
         </w:rPr>
       </w:pPr>
+      <w:proofErr w:type="gramStart"/>
       <w:r>
         <w:rPr>
           <w:rFonts w:ascii="Consolas" w:hAnsi="Consolas"/>
@@ -6341,6 +6422,7 @@
         </w:rPr>
         <w:t>(</w:t>
       </w:r>
+      <w:proofErr w:type="gramEnd"/>
       <w:r>
         <w:rPr>
           <w:rFonts w:ascii="Consolas" w:hAnsi="Consolas"/>
@@ -6516,6 +6598,7 @@
           <w:lang w:val="en-US"/>
         </w:rPr>
       </w:pPr>
+      <w:proofErr w:type="gramStart"/>
       <w:r>
         <w:rPr>
           <w:rFonts w:ascii="Consolas" w:hAnsi="Consolas"/>
@@ -6526,6 +6609,7 @@
         </w:rPr>
         <w:t>async</w:t>
       </w:r>
+      <w:proofErr w:type="gramEnd"/>
       <w:r>
         <w:rPr>
           <w:rFonts w:ascii="Consolas" w:hAnsi="Consolas"/>
@@ -6726,6 +6810,7 @@
         </w:rPr>
         <w:t xml:space="preserve"> </w:t>
       </w:r>
+      <w:proofErr w:type="gramStart"/>
       <w:r>
         <w:rPr>
           <w:rFonts w:ascii="Consolas" w:hAnsi="Consolas"/>
@@ -6736,6 +6821,7 @@
         </w:rPr>
         <w:t>await</w:t>
       </w:r>
+      <w:proofErr w:type="gramEnd"/>
       <w:r>
         <w:rPr>
           <w:rFonts w:ascii="Consolas" w:hAnsi="Consolas"/>
@@ -6861,6 +6947,7 @@
         </w:rPr>
         <w:t xml:space="preserve"> </w:t>
       </w:r>
+      <w:proofErr w:type="gramStart"/>
       <w:r>
         <w:rPr>
           <w:rFonts w:ascii="Consolas" w:hAnsi="Consolas"/>
@@ -6871,6 +6958,7 @@
         </w:rPr>
         <w:t>var</w:t>
       </w:r>
+      <w:proofErr w:type="gramEnd"/>
       <w:r>
         <w:rPr>
           <w:rFonts w:ascii="Consolas" w:hAnsi="Consolas"/>
@@ -6996,6 +7084,7 @@
         </w:rPr>
         <w:t xml:space="preserve"> </w:t>
       </w:r>
+      <w:proofErr w:type="gramStart"/>
       <w:r>
         <w:rPr>
           <w:rFonts w:ascii="Consolas" w:hAnsi="Consolas"/>
@@ -7036,6 +7125,7 @@
         </w:rPr>
         <w:t>(</w:t>
       </w:r>
+      <w:proofErr w:type="gramEnd"/>
       <w:r>
         <w:rPr>
           <w:rFonts w:ascii="Consolas" w:hAnsi="Consolas"/>
@@ -7349,9 +7439,9 @@
           <w:color w:val="000000"/>
           <w:sz w:val="18"/>
           <w:szCs w:val="21"/>
-          <w:lang w:val="en-US"/>
-        </w:rPr>
-      </w:pPr>
+        </w:rPr>
+      </w:pPr>
+      <w:proofErr w:type="gramStart"/>
       <w:r>
         <w:rPr>
           <w:rFonts w:ascii="Consolas" w:hAnsi="Consolas"/>
@@ -7362,13 +7452,13 @@
         </w:rPr>
         <w:t>var</w:t>
       </w:r>
-      <w:r>
-        <w:rPr>
-          <w:rFonts w:ascii="Consolas" w:hAnsi="Consolas"/>
-          <w:color w:val="000000"/>
-          <w:sz w:val="18"/>
-          <w:szCs w:val="21"/>
-          <w:lang w:val="en-US"/>
+      <w:proofErr w:type="gramEnd"/>
+      <w:r>
+        <w:rPr>
+          <w:rFonts w:ascii="Consolas" w:hAnsi="Consolas"/>
+          <w:color w:val="000000"/>
+          <w:sz w:val="18"/>
+          <w:szCs w:val="21"/>
         </w:rPr>
         <w:t xml:space="preserve"> </w:t>
       </w:r>
@@ -7388,7 +7478,6 @@
           <w:color w:val="001080"/>
           <w:sz w:val="18"/>
           <w:szCs w:val="21"/>
-          <w:lang w:val="en-US"/>
         </w:rPr>
         <w:t>1</w:t>
       </w:r>
@@ -7398,7 +7487,6 @@
           <w:color w:val="000000"/>
           <w:sz w:val="18"/>
           <w:szCs w:val="21"/>
-          <w:lang w:val="en-US"/>
         </w:rPr>
         <w:t xml:space="preserve"> = </w:t>
       </w:r>
@@ -7418,7 +7506,6 @@
           <w:color w:val="222222"/>
           <w:sz w:val="18"/>
           <w:szCs w:val="21"/>
-          <w:lang w:val="en-US"/>
         </w:rPr>
         <w:t>(</w:t>
       </w:r>
@@ -7428,7 +7515,6 @@
           <w:color w:val="A31515"/>
           <w:sz w:val="18"/>
           <w:szCs w:val="21"/>
-          <w:lang w:val="en-US"/>
         </w:rPr>
         <w:t>"</w:t>
       </w:r>
@@ -7447,7 +7533,6 @@
           <w:color w:val="A31515"/>
           <w:sz w:val="18"/>
           <w:szCs w:val="21"/>
-          <w:lang w:val="en-US"/>
         </w:rPr>
         <w:t xml:space="preserve"> </w:t>
       </w:r>
@@ -7466,7 +7551,6 @@
           <w:color w:val="A31515"/>
           <w:sz w:val="18"/>
           <w:szCs w:val="21"/>
-          <w:lang w:val="en-US"/>
         </w:rPr>
         <w:t>!"</w:t>
       </w:r>
@@ -7476,7 +7560,6 @@
           <w:color w:val="222222"/>
           <w:sz w:val="18"/>
           <w:szCs w:val="21"/>
-          <w:lang w:val="en-US"/>
         </w:rPr>
         <w:t>);</w:t>
       </w:r>
@@ -7495,6 +7578,7 @@
           <w:lang w:val="en-US"/>
         </w:rPr>
       </w:pPr>
+      <w:proofErr w:type="gramStart"/>
       <w:r>
         <w:rPr>
           <w:rFonts w:ascii="Consolas" w:hAnsi="Consolas"/>
@@ -7505,6 +7589,7 @@
         </w:rPr>
         <w:t>var</w:t>
       </w:r>
+      <w:proofErr w:type="gramEnd"/>
       <w:r>
         <w:rPr>
           <w:rFonts w:ascii="Consolas" w:hAnsi="Consolas"/>
@@ -7628,6 +7713,7 @@
           <w:lang w:val="en-US"/>
         </w:rPr>
       </w:pPr>
+      <w:proofErr w:type="gramStart"/>
       <w:r>
         <w:rPr>
           <w:rFonts w:ascii="Consolas" w:hAnsi="Consolas"/>
@@ -7638,6 +7724,7 @@
         </w:rPr>
         <w:t>var</w:t>
       </w:r>
+      <w:proofErr w:type="gramEnd"/>
       <w:r>
         <w:rPr>
           <w:rFonts w:ascii="Consolas" w:hAnsi="Consolas"/>
@@ -7742,6 +7829,7 @@
           <w:lang w:val="en-US"/>
         </w:rPr>
       </w:pPr>
+      <w:proofErr w:type="gramStart"/>
       <w:r>
         <w:rPr>
           <w:rFonts w:ascii="Consolas" w:hAnsi="Consolas"/>
@@ -7752,6 +7840,7 @@
         </w:rPr>
         <w:t>await</w:t>
       </w:r>
+      <w:proofErr w:type="gramEnd"/>
       <w:r>
         <w:rPr>
           <w:rFonts w:ascii="Consolas" w:hAnsi="Consolas"/>
@@ -7797,6 +7886,7 @@
           <w:lang w:val="en-US"/>
         </w:rPr>
       </w:pPr>
+      <w:proofErr w:type="gramStart"/>
       <w:r>
         <w:rPr>
           <w:rFonts w:ascii="Consolas" w:hAnsi="Consolas"/>
@@ -7807,6 +7897,7 @@
         </w:rPr>
         <w:t>await</w:t>
       </w:r>
+      <w:proofErr w:type="gramEnd"/>
       <w:r>
         <w:rPr>
           <w:rFonts w:ascii="Consolas" w:hAnsi="Consolas"/>
@@ -7852,6 +7943,7 @@
           <w:lang w:val="en-US"/>
         </w:rPr>
       </w:pPr>
+      <w:proofErr w:type="gramStart"/>
       <w:r>
         <w:rPr>
           <w:rFonts w:ascii="Consolas" w:hAnsi="Consolas"/>
@@ -7862,6 +7954,7 @@
         </w:rPr>
         <w:t>await</w:t>
       </w:r>
+      <w:proofErr w:type="gramEnd"/>
       <w:r>
         <w:rPr>
           <w:rFonts w:ascii="Consolas" w:hAnsi="Consolas"/>
@@ -7958,9 +8051,9 @@
           <w:color w:val="000000"/>
           <w:sz w:val="18"/>
           <w:szCs w:val="21"/>
-          <w:lang w:val="en-US"/>
-        </w:rPr>
-      </w:pPr>
+        </w:rPr>
+      </w:pPr>
+      <w:proofErr w:type="gramStart"/>
       <w:r>
         <w:rPr>
           <w:rFonts w:ascii="Consolas" w:hAnsi="Consolas"/>
@@ -7971,13 +8064,13 @@
         </w:rPr>
         <w:t>var</w:t>
       </w:r>
-      <w:r>
-        <w:rPr>
-          <w:rFonts w:ascii="Consolas" w:hAnsi="Consolas"/>
-          <w:color w:val="000000"/>
-          <w:sz w:val="18"/>
-          <w:szCs w:val="21"/>
-          <w:lang w:val="en-US"/>
+      <w:proofErr w:type="gramEnd"/>
+      <w:r>
+        <w:rPr>
+          <w:rFonts w:ascii="Consolas" w:hAnsi="Consolas"/>
+          <w:color w:val="000000"/>
+          <w:sz w:val="18"/>
+          <w:szCs w:val="21"/>
         </w:rPr>
         <w:t xml:space="preserve"> </w:t>
       </w:r>
@@ -7997,7 +8090,6 @@
           <w:color w:val="001080"/>
           <w:sz w:val="18"/>
           <w:szCs w:val="21"/>
-          <w:lang w:val="en-US"/>
         </w:rPr>
         <w:t>1</w:t>
       </w:r>
@@ -8007,7 +8099,6 @@
           <w:color w:val="000000"/>
           <w:sz w:val="18"/>
           <w:szCs w:val="21"/>
-          <w:lang w:val="en-US"/>
         </w:rPr>
         <w:t xml:space="preserve"> = </w:t>
       </w:r>
@@ -8027,7 +8118,6 @@
           <w:color w:val="222222"/>
           <w:sz w:val="18"/>
           <w:szCs w:val="21"/>
-          <w:lang w:val="en-US"/>
         </w:rPr>
         <w:t>(</w:t>
       </w:r>
@@ -8037,7 +8127,6 @@
           <w:color w:val="A31515"/>
           <w:sz w:val="18"/>
           <w:szCs w:val="21"/>
-          <w:lang w:val="en-US"/>
         </w:rPr>
         <w:t>"</w:t>
       </w:r>
@@ -8056,7 +8145,6 @@
           <w:color w:val="A31515"/>
           <w:sz w:val="18"/>
           <w:szCs w:val="21"/>
-          <w:lang w:val="en-US"/>
         </w:rPr>
         <w:t xml:space="preserve"> </w:t>
       </w:r>
@@ -8076,7 +8164,6 @@
           <w:color w:val="A31515"/>
           <w:sz w:val="18"/>
           <w:szCs w:val="21"/>
-          <w:lang w:val="en-US"/>
         </w:rPr>
         <w:t>#"</w:t>
       </w:r>
@@ -8086,7 +8173,6 @@
           <w:color w:val="222222"/>
           <w:sz w:val="18"/>
           <w:szCs w:val="21"/>
-          <w:lang w:val="en-US"/>
         </w:rPr>
         <w:t>);</w:t>
       </w:r>
@@ -8105,6 +8191,7 @@
           <w:lang w:val="en-US"/>
         </w:rPr>
       </w:pPr>
+      <w:proofErr w:type="gramStart"/>
       <w:r>
         <w:rPr>
           <w:rFonts w:ascii="Consolas" w:hAnsi="Consolas"/>
@@ -8115,6 +8202,7 @@
         </w:rPr>
         <w:t>var</w:t>
       </w:r>
+      <w:proofErr w:type="gramEnd"/>
       <w:r>
         <w:rPr>
           <w:rFonts w:ascii="Consolas" w:hAnsi="Consolas"/>
@@ -8347,6 +8435,7 @@
           <w:lang w:val="en-US"/>
         </w:rPr>
       </w:pPr>
+      <w:proofErr w:type="gramStart"/>
       <w:r>
         <w:rPr>
           <w:rFonts w:ascii="Consolas" w:hAnsi="Consolas"/>
@@ -8357,6 +8446,7 @@
         </w:rPr>
         <w:t>await</w:t>
       </w:r>
+      <w:proofErr w:type="gramEnd"/>
       <w:r>
         <w:rPr>
           <w:rFonts w:ascii="Consolas" w:hAnsi="Consolas"/>
@@ -8502,6 +8592,7 @@
           <w:lang w:val="en-US"/>
         </w:rPr>
       </w:pPr>
+      <w:proofErr w:type="gramStart"/>
       <w:r>
         <w:rPr>
           <w:rFonts w:ascii="Consolas" w:hAnsi="Consolas"/>
@@ -8512,6 +8603,7 @@
         </w:rPr>
         <w:t>async</w:t>
       </w:r>
+      <w:proofErr w:type="gramEnd"/>
       <w:r>
         <w:rPr>
           <w:rFonts w:ascii="Consolas" w:hAnsi="Consolas"/>
@@ -8698,6 +8790,7 @@
         </w:rPr>
         <w:t xml:space="preserve"> </w:t>
       </w:r>
+      <w:proofErr w:type="gramStart"/>
       <w:r>
         <w:rPr>
           <w:rFonts w:ascii="Consolas" w:hAnsi="Consolas"/>
@@ -8708,6 +8801,7 @@
         </w:rPr>
         <w:t>await</w:t>
       </w:r>
+      <w:proofErr w:type="gramEnd"/>
       <w:r>
         <w:rPr>
           <w:rFonts w:ascii="Consolas" w:hAnsi="Consolas"/>
@@ -8832,6 +8926,7 @@
         </w:rPr>
         <w:t xml:space="preserve"> </w:t>
       </w:r>
+      <w:proofErr w:type="gramStart"/>
       <w:r>
         <w:rPr>
           <w:rFonts w:ascii="Consolas" w:hAnsi="Consolas"/>
@@ -8870,6 +8965,7 @@
         </w:rPr>
         <w:t>(</w:t>
       </w:r>
+      <w:proofErr w:type="gramEnd"/>
       <w:r>
         <w:rPr>
           <w:rFonts w:ascii="Consolas" w:hAnsi="Consolas"/>
@@ -8977,9 +9073,9 @@
           <w:color w:val="000000"/>
           <w:sz w:val="18"/>
           <w:szCs w:val="21"/>
-          <w:lang w:val="en-US"/>
-        </w:rPr>
-      </w:pPr>
+        </w:rPr>
+      </w:pPr>
+      <w:proofErr w:type="gramStart"/>
       <w:r>
         <w:rPr>
           <w:rFonts w:ascii="Consolas" w:hAnsi="Consolas"/>
@@ -8990,13 +9086,13 @@
         </w:rPr>
         <w:t>var</w:t>
       </w:r>
-      <w:r>
-        <w:rPr>
-          <w:rFonts w:ascii="Consolas" w:hAnsi="Consolas"/>
-          <w:color w:val="000000"/>
-          <w:sz w:val="18"/>
-          <w:szCs w:val="21"/>
-          <w:lang w:val="en-US"/>
+      <w:proofErr w:type="gramEnd"/>
+      <w:r>
+        <w:rPr>
+          <w:rFonts w:ascii="Consolas" w:hAnsi="Consolas"/>
+          <w:color w:val="000000"/>
+          <w:sz w:val="18"/>
+          <w:szCs w:val="21"/>
         </w:rPr>
         <w:t xml:space="preserve"> </w:t>
       </w:r>
@@ -9016,7 +9112,6 @@
           <w:color w:val="001080"/>
           <w:sz w:val="18"/>
           <w:szCs w:val="21"/>
-          <w:lang w:val="en-US"/>
         </w:rPr>
         <w:t>1</w:t>
       </w:r>
@@ -9026,7 +9121,6 @@
           <w:color w:val="000000"/>
           <w:sz w:val="18"/>
           <w:szCs w:val="21"/>
-          <w:lang w:val="en-US"/>
         </w:rPr>
         <w:t xml:space="preserve"> = </w:t>
       </w:r>
@@ -9046,7 +9140,6 @@
           <w:color w:val="222222"/>
           <w:sz w:val="18"/>
           <w:szCs w:val="21"/>
-          <w:lang w:val="en-US"/>
         </w:rPr>
         <w:t>(</w:t>
       </w:r>
@@ -9056,7 +9149,6 @@
           <w:color w:val="A31515"/>
           <w:sz w:val="18"/>
           <w:szCs w:val="21"/>
-          <w:lang w:val="en-US"/>
         </w:rPr>
         <w:t>"</w:t>
       </w:r>
@@ -9075,7 +9167,6 @@
           <w:color w:val="A31515"/>
           <w:sz w:val="18"/>
           <w:szCs w:val="21"/>
-          <w:lang w:val="en-US"/>
         </w:rPr>
         <w:t xml:space="preserve"> </w:t>
       </w:r>
@@ -9095,7 +9186,6 @@
           <w:color w:val="A31515"/>
           <w:sz w:val="18"/>
           <w:szCs w:val="21"/>
-          <w:lang w:val="en-US"/>
         </w:rPr>
         <w:t>#"</w:t>
       </w:r>
@@ -9105,7 +9195,6 @@
           <w:color w:val="222222"/>
           <w:sz w:val="18"/>
           <w:szCs w:val="21"/>
-          <w:lang w:val="en-US"/>
         </w:rPr>
         <w:t>);</w:t>
       </w:r>
@@ -9124,6 +9213,7 @@
           <w:lang w:val="en-US"/>
         </w:rPr>
       </w:pPr>
+      <w:proofErr w:type="gramStart"/>
       <w:r>
         <w:rPr>
           <w:rFonts w:ascii="Consolas" w:hAnsi="Consolas"/>
@@ -9134,6 +9224,7 @@
         </w:rPr>
         <w:t>var</w:t>
       </w:r>
+      <w:proofErr w:type="gramEnd"/>
       <w:r>
         <w:rPr>
           <w:rFonts w:ascii="Consolas" w:hAnsi="Consolas"/>
@@ -9366,6 +9457,7 @@
           <w:lang w:val="en-US"/>
         </w:rPr>
       </w:pPr>
+      <w:proofErr w:type="gramStart"/>
       <w:r>
         <w:rPr>
           <w:rFonts w:ascii="Consolas" w:hAnsi="Consolas"/>
@@ -9377,6 +9469,7 @@
         <w:lastRenderedPageBreak/>
         <w:t>await</w:t>
       </w:r>
+      <w:proofErr w:type="gramEnd"/>
       <w:r>
         <w:rPr>
           <w:rFonts w:ascii="Consolas" w:hAnsi="Consolas"/>
@@ -9522,6 +9615,7 @@
           <w:lang w:val="en-US"/>
         </w:rPr>
       </w:pPr>
+      <w:proofErr w:type="gramStart"/>
       <w:r>
         <w:rPr>
           <w:rFonts w:ascii="Consolas" w:hAnsi="Consolas"/>
@@ -9532,6 +9626,7 @@
         </w:rPr>
         <w:t>async</w:t>
       </w:r>
+      <w:proofErr w:type="gramEnd"/>
       <w:r>
         <w:rPr>
           <w:rFonts w:ascii="Consolas" w:hAnsi="Consolas"/>
@@ -9702,6 +9797,7 @@
         </w:rPr>
         <w:t xml:space="preserve"> </w:t>
       </w:r>
+      <w:proofErr w:type="gramStart"/>
       <w:r>
         <w:rPr>
           <w:rFonts w:ascii="Consolas" w:hAnsi="Consolas"/>
@@ -9712,6 +9808,7 @@
         </w:rPr>
         <w:t>await</w:t>
       </w:r>
+      <w:proofErr w:type="gramEnd"/>
       <w:r>
         <w:rPr>
           <w:rFonts w:ascii="Consolas" w:hAnsi="Consolas"/>
@@ -10261,6 +10358,7 @@
           <w:lang w:val="en-US"/>
         </w:rPr>
       </w:pPr>
+      <w:proofErr w:type="gramStart"/>
       <w:r>
         <w:rPr>
           <w:rFonts w:ascii="Consolas" w:hAnsi="Consolas"/>
@@ -10271,6 +10369,7 @@
         </w:rPr>
         <w:t>var</w:t>
       </w:r>
+      <w:proofErr w:type="gramEnd"/>
       <w:r>
         <w:rPr>
           <w:rFonts w:ascii="Consolas" w:hAnsi="Consolas"/>
@@ -10356,6 +10455,7 @@
           <w:lang w:val="en-US"/>
         </w:rPr>
       </w:pPr>
+      <w:proofErr w:type="gramStart"/>
       <w:r>
         <w:rPr>
           <w:rFonts w:ascii="Consolas" w:hAnsi="Consolas"/>
@@ -10366,6 +10466,7 @@
         </w:rPr>
         <w:t>var</w:t>
       </w:r>
+      <w:proofErr w:type="gramEnd"/>
       <w:r>
         <w:rPr>
           <w:rFonts w:ascii="Consolas" w:hAnsi="Consolas"/>
@@ -10542,6 +10643,7 @@
           <w:lang w:val="en-US"/>
         </w:rPr>
       </w:pPr>
+      <w:proofErr w:type="gramStart"/>
       <w:r>
         <w:rPr>
           <w:rFonts w:ascii="Consolas" w:hAnsi="Consolas"/>
@@ -10560,7 +10662,18 @@
           <w:szCs w:val="21"/>
           <w:lang w:val="en-US"/>
         </w:rPr>
-        <w:t>[]</w:t>
+        <w:t>[</w:t>
+      </w:r>
+      <w:proofErr w:type="gramEnd"/>
+      <w:r>
+        <w:rPr>
+          <w:rFonts w:ascii="Consolas" w:hAnsi="Consolas"/>
+          <w:color w:val="222222"/>
+          <w:sz w:val="18"/>
+          <w:szCs w:val="21"/>
+          <w:lang w:val="en-US"/>
+        </w:rPr>
+        <w:t>]</w:t>
       </w:r>
       <w:r>
         <w:rPr>
@@ -10747,6 +10860,7 @@
           <w:lang w:val="en-US"/>
         </w:rPr>
       </w:pPr>
+      <w:proofErr w:type="gramStart"/>
       <w:r>
         <w:rPr>
           <w:rFonts w:ascii="Consolas" w:hAnsi="Consolas"/>
@@ -10757,6 +10871,7 @@
         </w:rPr>
         <w:t>foreach</w:t>
       </w:r>
+      <w:proofErr w:type="gramEnd"/>
       <w:r>
         <w:rPr>
           <w:rFonts w:ascii="Consolas" w:hAnsi="Consolas"/>
@@ -10970,6 +11085,7 @@
         </w:rPr>
         <w:t xml:space="preserve"> </w:t>
       </w:r>
+      <w:proofErr w:type="gramStart"/>
       <w:r>
         <w:rPr>
           <w:rFonts w:ascii="Consolas" w:hAnsi="Consolas"/>
@@ -11010,6 +11126,7 @@
         </w:rPr>
         <w:t>(</w:t>
       </w:r>
+      <w:proofErr w:type="gramEnd"/>
       <w:r>
         <w:rPr>
           <w:rFonts w:ascii="Consolas" w:hAnsi="Consolas"/>
@@ -11045,6 +11162,7 @@
           <w:lang w:val="en-US"/>
         </w:rPr>
       </w:pPr>
+      <w:proofErr w:type="gramStart"/>
       <w:r>
         <w:rPr>
           <w:rFonts w:ascii="Consolas" w:hAnsi="Consolas"/>
@@ -11055,6 +11173,7 @@
         </w:rPr>
         <w:t>async</w:t>
       </w:r>
+      <w:proofErr w:type="gramEnd"/>
       <w:r>
         <w:rPr>
           <w:rFonts w:ascii="Consolas" w:hAnsi="Consolas"/>
@@ -11250,6 +11369,7 @@
         </w:rPr>
         <w:t xml:space="preserve"> </w:t>
       </w:r>
+      <w:proofErr w:type="gramStart"/>
       <w:r>
         <w:rPr>
           <w:rFonts w:ascii="Consolas" w:hAnsi="Consolas"/>
@@ -11260,6 +11380,7 @@
         </w:rPr>
         <w:t>await</w:t>
       </w:r>
+      <w:proofErr w:type="gramEnd"/>
       <w:r>
         <w:rPr>
           <w:rFonts w:ascii="Consolas" w:hAnsi="Consolas"/>
@@ -11385,6 +11506,7 @@
         </w:rPr>
         <w:t xml:space="preserve"> </w:t>
       </w:r>
+      <w:proofErr w:type="gramStart"/>
       <w:r>
         <w:rPr>
           <w:rFonts w:ascii="Consolas" w:hAnsi="Consolas"/>
@@ -11395,6 +11517,7 @@
         </w:rPr>
         <w:t>return</w:t>
       </w:r>
+      <w:proofErr w:type="gramEnd"/>
       <w:r>
         <w:rPr>
           <w:rFonts w:ascii="Consolas" w:hAnsi="Consolas"/>
@@ -11597,32 +11720,7 @@
           <w:sz w:val="22"/>
           <w:szCs w:val="22"/>
         </w:rPr>
-        <w:t xml:space="preserve">Программа должна быть загружена в </w:t>
-      </w:r>
-      <w:r>
-        <w:rPr>
-          <w:color w:val="000000" w:themeColor="text1"/>
-          <w:sz w:val="22"/>
-          <w:szCs w:val="22"/>
-          <w:lang w:val="en-US"/>
-        </w:rPr>
-        <w:t>GitHub</w:t>
-      </w:r>
-      <w:r>
-        <w:rPr>
-          <w:color w:val="000000" w:themeColor="text1"/>
-          <w:sz w:val="22"/>
-          <w:szCs w:val="22"/>
-        </w:rPr>
-        <w:t xml:space="preserve"> </w:t>
-      </w:r>
-      <w:r>
-        <w:rPr>
-          <w:color w:val="000000" w:themeColor="text1"/>
-          <w:sz w:val="22"/>
-          <w:szCs w:val="22"/>
-        </w:rPr>
-        <w:t>репозиторий.</w:t>
+        <w:t>Предусмотреть формы для ввода параметров расчёта и генерации данных.</w:t>
       </w:r>
     </w:p>
     <w:p>
@@ -11644,11 +11742,45 @@
       </w:pPr>
       <w:r>
         <w:rPr>
+          <w:b/>
           <w:color w:val="000000" w:themeColor="text1"/>
           <w:sz w:val="22"/>
           <w:szCs w:val="22"/>
         </w:rPr>
-        <w:t>Предусмотреть формы для ввода параметров расчёта и генерации данных.</w:t>
+        <w:t>Для оценки «Хорошо».</w:t>
+      </w:r>
+      <w:r>
+        <w:rPr>
+          <w:color w:val="000000" w:themeColor="text1"/>
+          <w:sz w:val="22"/>
+          <w:szCs w:val="22"/>
+        </w:rPr>
+        <w:t xml:space="preserve"> Предусмотреть отображение прогресса</w:t>
+      </w:r>
+      <w:r>
+        <w:rPr>
+          <w:color w:val="000000" w:themeColor="text1"/>
+          <w:sz w:val="22"/>
+          <w:szCs w:val="22"/>
+        </w:rPr>
+        <w:t xml:space="preserve"> с помощью </w:t>
+      </w:r>
+      <w:r>
+        <w:rPr>
+          <w:color w:val="000000" w:themeColor="text1"/>
+          <w:sz w:val="22"/>
+          <w:szCs w:val="22"/>
+          <w:lang w:val="en-US"/>
+        </w:rPr>
+        <w:t>ProgressBar</w:t>
+      </w:r>
+      <w:r>
+        <w:rPr>
+          <w:color w:val="000000" w:themeColor="text1"/>
+          <w:sz w:val="22"/>
+          <w:szCs w:val="22"/>
+        </w:rPr>
+        <w:t>.</w:t>
       </w:r>
     </w:p>
     <w:p>
@@ -11675,7 +11807,7 @@
           <w:sz w:val="22"/>
           <w:szCs w:val="22"/>
         </w:rPr>
-        <w:t>Для оценки «Хорошо».</w:t>
+        <w:t>Для оценки «Отлично».</w:t>
       </w:r>
       <w:r>
         <w:rPr>
@@ -11683,24 +11815,24 @@
           <w:sz w:val="22"/>
           <w:szCs w:val="22"/>
         </w:rPr>
-        <w:t xml:space="preserve"> Предусмотреть отображение прогресса</w:t>
+        <w:t xml:space="preserve"> Предусмотреть отмену выполнения задач с помощью </w:t>
       </w:r>
       <w:r>
         <w:rPr>
           <w:color w:val="000000" w:themeColor="text1"/>
           <w:sz w:val="22"/>
           <w:szCs w:val="22"/>
-        </w:rPr>
-        <w:t xml:space="preserve"> с помощью </w:t>
+          <w:lang w:val="en-US"/>
+        </w:rPr>
+        <w:t>CancelationToken</w:t>
       </w:r>
       <w:r>
         <w:rPr>
           <w:color w:val="000000" w:themeColor="text1"/>
           <w:sz w:val="22"/>
           <w:szCs w:val="22"/>
-          <w:lang w:val="en-US"/>
-        </w:rPr>
-        <w:t>ProgressBar</w:t>
+        </w:rPr>
+        <w:t>.</w:t>
       </w:r>
       <w:r>
         <w:rPr>
@@ -11708,60 +11840,27 @@
           <w:sz w:val="22"/>
           <w:szCs w:val="22"/>
         </w:rPr>
-        <w:t>.</w:t>
-      </w:r>
-    </w:p>
-    <w:p>
-      <w:pPr>
-        <w:numPr>
-          <w:ilvl w:val="0"/>
-          <w:numId w:val="4"/>
-        </w:numPr>
-        <w:tabs>
-          <w:tab w:val="clear" w:pos="720"/>
-        </w:tabs>
-        <w:ind w:left="284" w:hanging="284"/>
-        <w:jc w:val="both"/>
+        <w:t xml:space="preserve"> </w:t>
+      </w:r>
+      <w:bookmarkStart w:id="1" w:name="_GoBack"/>
+      <w:r>
         <w:rPr>
           <w:color w:val="000000" w:themeColor="text1"/>
           <w:sz w:val="22"/>
           <w:szCs w:val="22"/>
         </w:rPr>
-      </w:pPr>
-      <w:r>
-        <w:rPr>
-          <w:b/>
+        <w:t xml:space="preserve">Загрузить программу в </w:t>
+      </w:r>
+      <w:r>
+        <w:rPr>
           <w:color w:val="000000" w:themeColor="text1"/>
           <w:sz w:val="22"/>
           <w:szCs w:val="22"/>
-        </w:rPr>
-        <w:t>Для оценки «Отлично».</w:t>
-      </w:r>
-      <w:r>
-        <w:rPr>
-          <w:color w:val="000000" w:themeColor="text1"/>
-          <w:sz w:val="22"/>
-          <w:szCs w:val="22"/>
-        </w:rPr>
-        <w:t xml:space="preserve"> Предусмотреть отмену выполнения задач с помощью </w:t>
-      </w:r>
-      <w:r>
-        <w:rPr>
-          <w:color w:val="000000" w:themeColor="text1"/>
-          <w:sz w:val="22"/>
-          <w:szCs w:val="22"/>
-          <w:lang w:val="en-US"/>
-        </w:rPr>
-        <w:t>CancelationToken</w:t>
-      </w:r>
-      <w:r>
-        <w:rPr>
-          <w:color w:val="000000" w:themeColor="text1"/>
-          <w:sz w:val="22"/>
-          <w:szCs w:val="22"/>
-        </w:rPr>
-        <w:t>.</w:t>
-      </w:r>
+          <w:lang w:val="en-US"/>
+        </w:rPr>
+        <w:t>GitHub</w:t>
+      </w:r>
+      <w:bookmarkEnd w:id="1"/>
     </w:p>
     <w:p>
       <w:pPr>
@@ -12633,7 +12732,25 @@
           <w:sz w:val="22"/>
           <w:szCs w:val="22"/>
         </w:rPr>
-        <w:t>Рекурсивно удалить все файлы с расширением .tmp старше 1 дня.</w:t>
+        <w:t xml:space="preserve">Рекурсивно удалить все файлы с </w:t>
+      </w:r>
+      <w:proofErr w:type="gramStart"/>
+      <w:r>
+        <w:rPr>
+          <w:bCs/>
+          <w:sz w:val="22"/>
+          <w:szCs w:val="22"/>
+        </w:rPr>
+        <w:t>расширением .tmp</w:t>
+      </w:r>
+      <w:proofErr w:type="gramEnd"/>
+      <w:r>
+        <w:rPr>
+          <w:bCs/>
+          <w:sz w:val="22"/>
+          <w:szCs w:val="22"/>
+        </w:rPr>
+        <w:t> старше 1 дня.</w:t>
       </w:r>
     </w:p>
     <w:p>
@@ -12797,7 +12914,25 @@
           <w:sz w:val="22"/>
           <w:szCs w:val="22"/>
         </w:rPr>
-        <w:t>«Конвертировать» все .mp4-файлы в папке в «сжатый» формат (фактически — скопировать с новым расширением .compressed.mp4).</w:t>
+        <w:t xml:space="preserve">«Конвертировать» все .mp4-файлы в папке в «сжатый» формат (фактически — скопировать с новым </w:t>
+      </w:r>
+      <w:proofErr w:type="gramStart"/>
+      <w:r>
+        <w:rPr>
+          <w:bCs/>
+          <w:sz w:val="22"/>
+          <w:szCs w:val="22"/>
+        </w:rPr>
+        <w:t>расширением .</w:t>
+      </w:r>
+      <w:proofErr w:type="gramEnd"/>
+      <w:r>
+        <w:rPr>
+          <w:bCs/>
+          <w:sz w:val="22"/>
+          <w:szCs w:val="22"/>
+        </w:rPr>
+        <w:t>compressed.mp4).</w:t>
       </w:r>
     </w:p>
     <w:p>
@@ -12928,7 +13063,25 @@
           <w:sz w:val="22"/>
           <w:szCs w:val="22"/>
         </w:rPr>
-        <w:t>Скопировать все .png-файлы с шириной &gt; 1000 пикселей в папку /large.</w:t>
+        <w:t xml:space="preserve">Скопировать все .png-файлы с </w:t>
+      </w:r>
+      <w:proofErr w:type="gramStart"/>
+      <w:r>
+        <w:rPr>
+          <w:bCs/>
+          <w:sz w:val="22"/>
+          <w:szCs w:val="22"/>
+        </w:rPr>
+        <w:t>шириной &gt;</w:t>
+      </w:r>
+      <w:proofErr w:type="gramEnd"/>
+      <w:r>
+        <w:rPr>
+          <w:bCs/>
+          <w:sz w:val="22"/>
+          <w:szCs w:val="22"/>
+        </w:rPr>
+        <w:t xml:space="preserve"> 1000 пикселей в папку /large.</w:t>
       </w:r>
     </w:p>
     <w:p>
@@ -13052,7 +13205,16 @@
           <w:sz w:val="22"/>
           <w:szCs w:val="22"/>
         </w:rPr>
-        <w:t>Для всех .</w:t>
+        <w:t xml:space="preserve">Для </w:t>
+      </w:r>
+      <w:proofErr w:type="gramStart"/>
+      <w:r>
+        <w:rPr>
+          <w:bCs/>
+          <w:sz w:val="22"/>
+          <w:szCs w:val="22"/>
+        </w:rPr>
+        <w:t>всех .</w:t>
       </w:r>
       <w:r>
         <w:rPr>
@@ -13063,6 +13225,7 @@
         </w:rPr>
         <w:t>json</w:t>
       </w:r>
+      <w:proofErr w:type="gramEnd"/>
       <w:r>
         <w:rPr>
           <w:bCs/>
@@ -13601,6 +13764,7 @@
           <w:lang w:val="en-US"/>
         </w:rPr>
       </w:pPr>
+      <w:proofErr w:type="gramStart"/>
       <w:r>
         <w:rPr>
           <w:rFonts w:ascii="Consolas" w:hAnsi="Consolas" w:cs="Cascadia Mono"/>
@@ -13612,6 +13776,7 @@
         </w:rPr>
         <w:t>namespace</w:t>
       </w:r>
+      <w:proofErr w:type="gramEnd"/>
       <w:r>
         <w:rPr>
           <w:rFonts w:ascii="Consolas" w:hAnsi="Consolas" w:cs="Cascadia Mono"/>
@@ -13659,6 +13824,7 @@
           <w:lang w:val="en-US"/>
         </w:rPr>
       </w:pPr>
+      <w:proofErr w:type="gramStart"/>
       <w:r>
         <w:rPr>
           <w:rFonts w:ascii="Consolas" w:hAnsi="Consolas" w:cs="Cascadia Mono"/>
@@ -13670,6 +13836,7 @@
         </w:rPr>
         <w:t>public</w:t>
       </w:r>
+      <w:proofErr w:type="gramEnd"/>
       <w:r>
         <w:rPr>
           <w:rFonts w:ascii="Consolas" w:hAnsi="Consolas" w:cs="Cascadia Mono"/>
@@ -13794,6 +13961,7 @@
         </w:rPr>
         <w:t xml:space="preserve">    </w:t>
       </w:r>
+      <w:proofErr w:type="gramStart"/>
       <w:r>
         <w:rPr>
           <w:rFonts w:ascii="Consolas" w:hAnsi="Consolas" w:cs="Cascadia Mono"/>
@@ -13805,6 +13973,7 @@
         </w:rPr>
         <w:t>public</w:t>
       </w:r>
+      <w:proofErr w:type="gramEnd"/>
       <w:r>
         <w:rPr>
           <w:rFonts w:ascii="Consolas" w:hAnsi="Consolas" w:cs="Cascadia Mono"/>
@@ -14549,6 +14718,7 @@
         </w:rPr>
         <w:t xml:space="preserve">    </w:t>
       </w:r>
+      <w:proofErr w:type="gramStart"/>
       <w:r>
         <w:rPr>
           <w:rFonts w:ascii="Consolas" w:hAnsi="Consolas" w:cs="Cascadia Mono"/>
@@ -14560,6 +14730,7 @@
         </w:rPr>
         <w:t>private</w:t>
       </w:r>
+      <w:proofErr w:type="gramEnd"/>
       <w:r>
         <w:rPr>
           <w:rFonts w:ascii="Consolas" w:hAnsi="Consolas" w:cs="Cascadia Mono"/>
@@ -14662,6 +14833,7 @@
         </w:rPr>
         <w:t xml:space="preserve">    </w:t>
       </w:r>
+      <w:proofErr w:type="gramStart"/>
       <w:r>
         <w:rPr>
           <w:rFonts w:ascii="Consolas" w:hAnsi="Consolas" w:cs="Cascadia Mono"/>
@@ -14673,6 +14845,7 @@
         </w:rPr>
         <w:t>private</w:t>
       </w:r>
+      <w:proofErr w:type="gramEnd"/>
       <w:r>
         <w:rPr>
           <w:rFonts w:ascii="Consolas" w:hAnsi="Consolas" w:cs="Cascadia Mono"/>
@@ -14804,6 +14977,7 @@
         </w:rPr>
         <w:t xml:space="preserve"> </w:t>
       </w:r>
+      <w:proofErr w:type="gramStart"/>
       <w:r>
         <w:rPr>
           <w:rFonts w:ascii="Consolas" w:hAnsi="Consolas" w:cs="Cascadia Mono"/>
@@ -14815,6 +14989,7 @@
         </w:rPr>
         <w:t>public</w:t>
       </w:r>
+      <w:proofErr w:type="gramEnd"/>
       <w:r>
         <w:rPr>
           <w:rFonts w:ascii="Consolas" w:hAnsi="Consolas" w:cs="Cascadia Mono"/>
@@ -14868,7 +15043,19 @@
           <w:highlight w:val="white"/>
           <w:lang w:val="en-US"/>
         </w:rPr>
-        <w:t xml:space="preserve">&gt;? Comparer { </w:t>
+        <w:t xml:space="preserve">&gt;? Comparer </w:t>
+      </w:r>
+      <w:proofErr w:type="gramStart"/>
+      <w:r>
+        <w:rPr>
+          <w:rFonts w:ascii="Consolas" w:hAnsi="Consolas" w:cs="Cascadia Mono"/>
+          <w:color w:val="000000"/>
+          <w:sz w:val="18"/>
+          <w:szCs w:val="18"/>
+          <w:highlight w:val="white"/>
+          <w:lang w:val="en-US"/>
+        </w:rPr>
+        <w:t xml:space="preserve">{ </w:t>
       </w:r>
       <w:r>
         <w:rPr>
@@ -14881,6 +15068,7 @@
         </w:rPr>
         <w:t>get</w:t>
       </w:r>
+      <w:proofErr w:type="gramEnd"/>
       <w:r>
         <w:rPr>
           <w:rFonts w:ascii="Consolas" w:hAnsi="Consolas" w:cs="Cascadia Mono"/>
@@ -15047,7 +15235,21 @@
         <w:rPr>
           <w:bCs/>
         </w:rPr>
-        <w:t>Более эффективен, чем ToLower() при каждом сравнении</w:t>
+        <w:t>Более эффективен, чем </w:t>
+      </w:r>
+      <w:proofErr w:type="gramStart"/>
+      <w:r>
+        <w:rPr>
+          <w:bCs/>
+        </w:rPr>
+        <w:t>ToLower(</w:t>
+      </w:r>
+      <w:proofErr w:type="gramEnd"/>
+      <w:r>
+        <w:rPr>
+          <w:bCs/>
+        </w:rPr>
+        <w:t>) при каждом сравнении</w:t>
       </w:r>
     </w:p>
     <w:p>
@@ -15177,6 +15379,7 @@
         </w:rPr>
         <w:t xml:space="preserve">    </w:t>
       </w:r>
+      <w:proofErr w:type="gramStart"/>
       <w:r>
         <w:rPr>
           <w:rFonts w:ascii="Consolas" w:hAnsi="Consolas" w:cs="Cascadia Mono"/>
@@ -15188,6 +15391,7 @@
         </w:rPr>
         <w:t>public</w:t>
       </w:r>
+      <w:proofErr w:type="gramEnd"/>
       <w:r>
         <w:rPr>
           <w:rFonts w:ascii="Consolas" w:hAnsi="Consolas" w:cs="Cascadia Mono"/>
@@ -15277,7 +15481,31 @@
           <w:highlight w:val="white"/>
           <w:lang w:val="en-US"/>
         </w:rPr>
-        <w:t xml:space="preserve">        allWordCounts = </w:t>
+        <w:t xml:space="preserve">        </w:t>
+      </w:r>
+      <w:proofErr w:type="gramStart"/>
+      <w:r>
+        <w:rPr>
+          <w:rFonts w:ascii="Consolas" w:hAnsi="Consolas" w:cs="Cascadia Mono"/>
+          <w:color w:val="000000"/>
+          <w:sz w:val="18"/>
+          <w:szCs w:val="19"/>
+          <w:highlight w:val="white"/>
+          <w:lang w:val="en-US"/>
+        </w:rPr>
+        <w:t>allWordCounts</w:t>
+      </w:r>
+      <w:proofErr w:type="gramEnd"/>
+      <w:r>
+        <w:rPr>
+          <w:rFonts w:ascii="Consolas" w:hAnsi="Consolas" w:cs="Cascadia Mono"/>
+          <w:color w:val="000000"/>
+          <w:sz w:val="18"/>
+          <w:szCs w:val="19"/>
+          <w:highlight w:val="white"/>
+          <w:lang w:val="en-US"/>
+        </w:rPr>
+        <w:t xml:space="preserve"> = </w:t>
       </w:r>
       <w:r>
         <w:rPr>
@@ -15445,7 +15673,31 @@
           <w:highlight w:val="white"/>
           <w:lang w:val="en-US"/>
         </w:rPr>
-        <w:t xml:space="preserve">        ignoredWords = </w:t>
+        <w:t xml:space="preserve">        </w:t>
+      </w:r>
+      <w:proofErr w:type="gramStart"/>
+      <w:r>
+        <w:rPr>
+          <w:rFonts w:ascii="Consolas" w:hAnsi="Consolas" w:cs="Cascadia Mono"/>
+          <w:color w:val="000000"/>
+          <w:sz w:val="18"/>
+          <w:szCs w:val="19"/>
+          <w:highlight w:val="white"/>
+          <w:lang w:val="en-US"/>
+        </w:rPr>
+        <w:t>ignoredWords</w:t>
+      </w:r>
+      <w:proofErr w:type="gramEnd"/>
+      <w:r>
+        <w:rPr>
+          <w:rFonts w:ascii="Consolas" w:hAnsi="Consolas" w:cs="Cascadia Mono"/>
+          <w:color w:val="000000"/>
+          <w:sz w:val="18"/>
+          <w:szCs w:val="19"/>
+          <w:highlight w:val="white"/>
+          <w:lang w:val="en-US"/>
+        </w:rPr>
+        <w:t xml:space="preserve"> = </w:t>
       </w:r>
       <w:r>
         <w:rPr>
@@ -15644,6 +15896,7 @@
           <w:lang w:val="en-US"/>
         </w:rPr>
       </w:pPr>
+      <w:proofErr w:type="gramStart"/>
       <w:r>
         <w:rPr>
           <w:rFonts w:ascii="Consolas" w:hAnsi="Consolas" w:cs="Cascadia Mono"/>
@@ -15655,6 +15908,7 @@
         </w:rPr>
         <w:t>public</w:t>
       </w:r>
+      <w:proofErr w:type="gramEnd"/>
       <w:r>
         <w:rPr>
           <w:rFonts w:ascii="Consolas" w:hAnsi="Consolas" w:cs="Cascadia Mono"/>
@@ -15788,7 +16042,31 @@
           <w:highlight w:val="white"/>
           <w:lang w:val="en-US"/>
         </w:rPr>
-        <w:t xml:space="preserve">    allWordCounts = </w:t>
+        <w:t xml:space="preserve">    </w:t>
+      </w:r>
+      <w:proofErr w:type="gramStart"/>
+      <w:r>
+        <w:rPr>
+          <w:rFonts w:ascii="Consolas" w:hAnsi="Consolas" w:cs="Cascadia Mono"/>
+          <w:color w:val="000000"/>
+          <w:sz w:val="18"/>
+          <w:szCs w:val="19"/>
+          <w:highlight w:val="white"/>
+          <w:lang w:val="en-US"/>
+        </w:rPr>
+        <w:t>allWordCounts</w:t>
+      </w:r>
+      <w:proofErr w:type="gramEnd"/>
+      <w:r>
+        <w:rPr>
+          <w:rFonts w:ascii="Consolas" w:hAnsi="Consolas" w:cs="Cascadia Mono"/>
+          <w:color w:val="000000"/>
+          <w:sz w:val="18"/>
+          <w:szCs w:val="19"/>
+          <w:highlight w:val="white"/>
+          <w:lang w:val="en-US"/>
+        </w:rPr>
+        <w:t xml:space="preserve"> = </w:t>
       </w:r>
       <w:r>
         <w:rPr>
@@ -15907,6 +16185,7 @@
         </w:rPr>
         <w:t xml:space="preserve">    </w:t>
       </w:r>
+      <w:proofErr w:type="gramStart"/>
       <w:r>
         <w:rPr>
           <w:rFonts w:ascii="Consolas" w:hAnsi="Consolas" w:cs="Cascadia Mono"/>
@@ -15918,6 +16197,7 @@
         </w:rPr>
         <w:t>return</w:t>
       </w:r>
+      <w:proofErr w:type="gramEnd"/>
       <w:r>
         <w:rPr>
           <w:rFonts w:ascii="Consolas" w:hAnsi="Consolas" w:cs="Cascadia Mono"/>
@@ -16016,6 +16296,7 @@
           <w:lang w:val="en-US"/>
         </w:rPr>
       </w:pPr>
+      <w:proofErr w:type="gramStart"/>
       <w:r>
         <w:rPr>
           <w:rFonts w:ascii="Consolas" w:hAnsi="Consolas" w:cs="Cascadia Mono"/>
@@ -16027,6 +16308,7 @@
         </w:rPr>
         <w:t>public</w:t>
       </w:r>
+      <w:proofErr w:type="gramEnd"/>
       <w:r>
         <w:rPr>
           <w:rFonts w:ascii="Consolas" w:hAnsi="Consolas" w:cs="Cascadia Mono"/>
@@ -16213,6 +16495,7 @@
         </w:rPr>
         <w:t xml:space="preserve">    </w:t>
       </w:r>
+      <w:proofErr w:type="gramStart"/>
       <w:r>
         <w:rPr>
           <w:rFonts w:ascii="Consolas" w:hAnsi="Consolas" w:cs="Cascadia Mono"/>
@@ -16224,6 +16507,7 @@
         </w:rPr>
         <w:t>return</w:t>
       </w:r>
+      <w:proofErr w:type="gramEnd"/>
       <w:r>
         <w:rPr>
           <w:rFonts w:ascii="Consolas" w:hAnsi="Consolas" w:cs="Cascadia Mono"/>
@@ -16342,7 +16626,25 @@
           <w:sz w:val="22"/>
           <w:szCs w:val="22"/>
         </w:rPr>
-        <w:t>new Analyzer().AddComparer(...).AddIgnoreWords(...)</w:t>
+        <w:t xml:space="preserve">new </w:t>
+      </w:r>
+      <w:proofErr w:type="gramStart"/>
+      <w:r>
+        <w:rPr>
+          <w:bCs/>
+          <w:sz w:val="22"/>
+          <w:szCs w:val="22"/>
+        </w:rPr>
+        <w:t>Analyzer(</w:t>
+      </w:r>
+      <w:proofErr w:type="gramEnd"/>
+      <w:r>
+        <w:rPr>
+          <w:bCs/>
+          <w:sz w:val="22"/>
+          <w:szCs w:val="22"/>
+        </w:rPr>
+        <w:t>).AddComparer(...).AddIgnoreWords(...)</w:t>
       </w:r>
     </w:p>
     <w:p>
@@ -16457,6 +16759,7 @@
         </w:rPr>
         <w:t xml:space="preserve">    </w:t>
       </w:r>
+      <w:proofErr w:type="gramStart"/>
       <w:r>
         <w:rPr>
           <w:rFonts w:ascii="Consolas" w:hAnsi="Consolas" w:cs="Cascadia Mono"/>
@@ -16468,6 +16771,7 @@
         </w:rPr>
         <w:t>public</w:t>
       </w:r>
+      <w:proofErr w:type="gramEnd"/>
       <w:r>
         <w:rPr>
           <w:rFonts w:ascii="Consolas" w:hAnsi="Consolas" w:cs="Cascadia Mono"/>
@@ -16603,6 +16907,7 @@
         </w:rPr>
         <w:t xml:space="preserve">        </w:t>
       </w:r>
+      <w:proofErr w:type="gramStart"/>
       <w:r>
         <w:rPr>
           <w:rFonts w:ascii="Consolas" w:hAnsi="Consolas" w:cs="Cascadia Mono"/>
@@ -16614,6 +16919,7 @@
         </w:rPr>
         <w:t>var</w:t>
       </w:r>
+      <w:proofErr w:type="gramEnd"/>
       <w:r>
         <w:rPr>
           <w:rFonts w:ascii="Consolas" w:hAnsi="Consolas" w:cs="Cascadia Mono"/>
@@ -16696,7 +17002,31 @@
           <w:highlight w:val="white"/>
           <w:lang w:val="en-US"/>
         </w:rPr>
-        <w:t xml:space="preserve">        allWordCounts.Clear();</w:t>
+        <w:t xml:space="preserve">        </w:t>
+      </w:r>
+      <w:proofErr w:type="gramStart"/>
+      <w:r>
+        <w:rPr>
+          <w:rFonts w:ascii="Consolas" w:hAnsi="Consolas" w:cs="Cascadia Mono"/>
+          <w:color w:val="000000"/>
+          <w:sz w:val="18"/>
+          <w:szCs w:val="19"/>
+          <w:highlight w:val="white"/>
+          <w:lang w:val="en-US"/>
+        </w:rPr>
+        <w:t>allWordCounts.Clear(</w:t>
+      </w:r>
+      <w:proofErr w:type="gramEnd"/>
+      <w:r>
+        <w:rPr>
+          <w:rFonts w:ascii="Consolas" w:hAnsi="Consolas" w:cs="Cascadia Mono"/>
+          <w:color w:val="000000"/>
+          <w:sz w:val="18"/>
+          <w:szCs w:val="19"/>
+          <w:highlight w:val="white"/>
+          <w:lang w:val="en-US"/>
+        </w:rPr>
+        <w:t>);</w:t>
       </w:r>
     </w:p>
     <w:p>
@@ -16745,6 +17075,7 @@
         </w:rPr>
         <w:t xml:space="preserve">        </w:t>
       </w:r>
+      <w:proofErr w:type="gramStart"/>
       <w:r>
         <w:rPr>
           <w:rFonts w:ascii="Consolas" w:hAnsi="Consolas" w:cs="Cascadia Mono"/>
@@ -16756,6 +17087,7 @@
         </w:rPr>
         <w:t>var</w:t>
       </w:r>
+      <w:proofErr w:type="gramEnd"/>
       <w:r>
         <w:rPr>
           <w:rFonts w:ascii="Consolas" w:hAnsi="Consolas" w:cs="Cascadia Mono"/>
@@ -16796,6 +17128,7 @@
         </w:rPr>
         <w:t xml:space="preserve">        </w:t>
       </w:r>
+      <w:proofErr w:type="gramStart"/>
       <w:r>
         <w:rPr>
           <w:rFonts w:ascii="Consolas" w:hAnsi="Consolas" w:cs="Cascadia Mono"/>
@@ -16807,6 +17140,7 @@
         </w:rPr>
         <w:t>await</w:t>
       </w:r>
+      <w:proofErr w:type="gramEnd"/>
       <w:r>
         <w:rPr>
           <w:rFonts w:ascii="Consolas" w:hAnsi="Consolas" w:cs="Cascadia Mono"/>
@@ -16952,11 +17286,19 @@
           <w:bCs/>
         </w:rPr>
       </w:pPr>
-      <w:r>
-        <w:rPr>
-          <w:bCs/>
-        </w:rPr>
-        <w:t>Clear() очищает результаты предыдущих анализов</w:t>
+      <w:proofErr w:type="gramStart"/>
+      <w:r>
+        <w:rPr>
+          <w:bCs/>
+        </w:rPr>
+        <w:t>Clear(</w:t>
+      </w:r>
+      <w:proofErr w:type="gramEnd"/>
+      <w:r>
+        <w:rPr>
+          <w:bCs/>
+        </w:rPr>
+        <w:t>) очищает результаты предыдущих анализов</w:t>
       </w:r>
     </w:p>
     <w:p>
@@ -17058,6 +17400,7 @@
         </w:rPr>
         <w:t xml:space="preserve">    </w:t>
       </w:r>
+      <w:proofErr w:type="gramStart"/>
       <w:r>
         <w:rPr>
           <w:rFonts w:ascii="Consolas" w:hAnsi="Consolas" w:cs="Cascadia Mono"/>
@@ -17069,6 +17412,7 @@
         </w:rPr>
         <w:t>private</w:t>
       </w:r>
+      <w:proofErr w:type="gramEnd"/>
       <w:r>
         <w:rPr>
           <w:rFonts w:ascii="Consolas" w:hAnsi="Consolas" w:cs="Cascadia Mono"/>
@@ -17270,6 +17614,7 @@
         </w:rPr>
         <w:t xml:space="preserve">        </w:t>
       </w:r>
+      <w:proofErr w:type="gramStart"/>
       <w:r>
         <w:rPr>
           <w:rFonts w:ascii="Consolas" w:hAnsi="Consolas" w:cs="Cascadia Mono"/>
@@ -17281,6 +17626,7 @@
         </w:rPr>
         <w:t>var</w:t>
       </w:r>
+      <w:proofErr w:type="gramEnd"/>
       <w:r>
         <w:rPr>
           <w:rFonts w:ascii="Consolas" w:hAnsi="Consolas" w:cs="Cascadia Mono"/>
@@ -17365,6 +17711,7 @@
         </w:rPr>
         <w:t xml:space="preserve">        </w:t>
       </w:r>
+      <w:proofErr w:type="gramStart"/>
       <w:r>
         <w:rPr>
           <w:rFonts w:ascii="Consolas" w:hAnsi="Consolas" w:cs="Cascadia Mono"/>
@@ -17376,6 +17723,7 @@
         </w:rPr>
         <w:t>var</w:t>
       </w:r>
+      <w:proofErr w:type="gramEnd"/>
       <w:r>
         <w:rPr>
           <w:rFonts w:ascii="Consolas" w:hAnsi="Consolas" w:cs="Cascadia Mono"/>
@@ -17434,6 +17782,7 @@
         </w:rPr>
         <w:t xml:space="preserve">        </w:t>
       </w:r>
+      <w:proofErr w:type="gramStart"/>
       <w:r>
         <w:rPr>
           <w:rFonts w:ascii="Consolas" w:hAnsi="Consolas" w:cs="Cascadia Mono"/>
@@ -17445,6 +17794,7 @@
         </w:rPr>
         <w:t>foreach</w:t>
       </w:r>
+      <w:proofErr w:type="gramEnd"/>
       <w:r>
         <w:rPr>
           <w:rFonts w:ascii="Consolas" w:hAnsi="Consolas" w:cs="Cascadia Mono"/>
@@ -17558,6 +17908,7 @@
         </w:rPr>
         <w:t xml:space="preserve">            </w:t>
       </w:r>
+      <w:proofErr w:type="gramStart"/>
       <w:r>
         <w:rPr>
           <w:rFonts w:ascii="Consolas" w:hAnsi="Consolas" w:cs="Cascadia Mono"/>
@@ -17569,6 +17920,7 @@
         </w:rPr>
         <w:t>if</w:t>
       </w:r>
+      <w:proofErr w:type="gramEnd"/>
       <w:r>
         <w:rPr>
           <w:rFonts w:ascii="Consolas" w:hAnsi="Consolas" w:cs="Cascadia Mono"/>
@@ -17636,7 +17988,31 @@
           <w:highlight w:val="white"/>
           <w:lang w:val="en-US"/>
         </w:rPr>
-        <w:t xml:space="preserve">                wordCounts[word]++;</w:t>
+        <w:t xml:space="preserve">                </w:t>
+      </w:r>
+      <w:proofErr w:type="gramStart"/>
+      <w:r>
+        <w:rPr>
+          <w:rFonts w:ascii="Consolas" w:hAnsi="Consolas" w:cs="Cascadia Mono"/>
+          <w:color w:val="000000"/>
+          <w:sz w:val="18"/>
+          <w:szCs w:val="19"/>
+          <w:highlight w:val="white"/>
+          <w:lang w:val="en-US"/>
+        </w:rPr>
+        <w:t>wordCounts[</w:t>
+      </w:r>
+      <w:proofErr w:type="gramEnd"/>
+      <w:r>
+        <w:rPr>
+          <w:rFonts w:ascii="Consolas" w:hAnsi="Consolas" w:cs="Cascadia Mono"/>
+          <w:color w:val="000000"/>
+          <w:sz w:val="18"/>
+          <w:szCs w:val="19"/>
+          <w:highlight w:val="white"/>
+          <w:lang w:val="en-US"/>
+        </w:rPr>
+        <w:t>word]++;</w:t>
       </w:r>
     </w:p>
     <w:p>
@@ -17927,14 +18303,38 @@
           <w:bCs/>
           <w:sz w:val="22"/>
           <w:szCs w:val="22"/>
-        </w:rPr>
-      </w:pPr>
-      <w:r>
-        <w:rPr>
-          <w:sz w:val="22"/>
-          <w:szCs w:val="22"/>
-        </w:rPr>
-        <w:t>3.6. Извлечение слов</w:t>
+          <w:lang w:val="en-US"/>
+        </w:rPr>
+      </w:pPr>
+      <w:r>
+        <w:rPr>
+          <w:sz w:val="22"/>
+          <w:szCs w:val="22"/>
+          <w:lang w:val="en-US"/>
+        </w:rPr>
+        <w:t xml:space="preserve">3.6. </w:t>
+      </w:r>
+      <w:r>
+        <w:rPr>
+          <w:sz w:val="22"/>
+          <w:szCs w:val="22"/>
+        </w:rPr>
+        <w:t>Извлечение</w:t>
+      </w:r>
+      <w:r>
+        <w:rPr>
+          <w:sz w:val="22"/>
+          <w:szCs w:val="22"/>
+          <w:lang w:val="en-US"/>
+        </w:rPr>
+        <w:t xml:space="preserve"> </w:t>
+      </w:r>
+      <w:r>
+        <w:rPr>
+          <w:sz w:val="22"/>
+          <w:szCs w:val="22"/>
+        </w:rPr>
+        <w:t>слов</w:t>
       </w:r>
     </w:p>
     <w:p>
@@ -17965,6 +18365,7 @@
         </w:rPr>
         <w:t xml:space="preserve">    </w:t>
       </w:r>
+      <w:proofErr w:type="gramStart"/>
       <w:r>
         <w:rPr>
           <w:rFonts w:ascii="Consolas" w:hAnsi="Consolas" w:cs="Cascadia Mono"/>
@@ -17976,6 +18377,7 @@
         </w:rPr>
         <w:t>private</w:t>
       </w:r>
+      <w:proofErr w:type="gramEnd"/>
       <w:r>
         <w:rPr>
           <w:rFonts w:ascii="Consolas" w:hAnsi="Consolas" w:cs="Cascadia Mono"/>
@@ -18111,6 +18513,7 @@
         </w:rPr>
         <w:t xml:space="preserve">        </w:t>
       </w:r>
+      <w:proofErr w:type="gramStart"/>
       <w:r>
         <w:rPr>
           <w:rFonts w:ascii="Consolas" w:hAnsi="Consolas" w:cs="Cascadia Mono"/>
@@ -18122,6 +18525,7 @@
         </w:rPr>
         <w:t>var</w:t>
       </w:r>
+      <w:proofErr w:type="gramEnd"/>
       <w:r>
         <w:rPr>
           <w:rFonts w:ascii="Consolas" w:hAnsi="Consolas" w:cs="Cascadia Mono"/>
@@ -18272,6 +18676,7 @@
         </w:rPr>
         <w:t xml:space="preserve">        </w:t>
       </w:r>
+      <w:proofErr w:type="gramStart"/>
       <w:r>
         <w:rPr>
           <w:rFonts w:ascii="Consolas" w:hAnsi="Consolas" w:cs="Cascadia Mono"/>
@@ -18283,6 +18688,7 @@
         </w:rPr>
         <w:t>return</w:t>
       </w:r>
+      <w:proofErr w:type="gramEnd"/>
       <w:r>
         <w:rPr>
           <w:rFonts w:ascii="Consolas" w:hAnsi="Consolas" w:cs="Cascadia Mono"/>
@@ -18321,7 +18727,31 @@
           <w:highlight w:val="white"/>
           <w:lang w:val="en-US"/>
         </w:rPr>
-        <w:t xml:space="preserve">            .Select(m =&gt; m.Value.ToLower())</w:t>
+        <w:t xml:space="preserve">            .</w:t>
+      </w:r>
+      <w:proofErr w:type="gramStart"/>
+      <w:r>
+        <w:rPr>
+          <w:rFonts w:ascii="Consolas" w:hAnsi="Consolas" w:cs="Cascadia Mono"/>
+          <w:color w:val="000000"/>
+          <w:sz w:val="18"/>
+          <w:szCs w:val="19"/>
+          <w:highlight w:val="white"/>
+          <w:lang w:val="en-US"/>
+        </w:rPr>
+        <w:t>Select(</w:t>
+      </w:r>
+      <w:proofErr w:type="gramEnd"/>
+      <w:r>
+        <w:rPr>
+          <w:rFonts w:ascii="Consolas" w:hAnsi="Consolas" w:cs="Cascadia Mono"/>
+          <w:color w:val="000000"/>
+          <w:sz w:val="18"/>
+          <w:szCs w:val="19"/>
+          <w:highlight w:val="white"/>
+          <w:lang w:val="en-US"/>
+        </w:rPr>
+        <w:t>m =&gt; m.Value.ToLower())</w:t>
       </w:r>
     </w:p>
     <w:p>
@@ -18350,7 +18780,31 @@
           <w:highlight w:val="white"/>
           <w:lang w:val="en-US"/>
         </w:rPr>
-        <w:t xml:space="preserve">            .Where(w =&gt; !ignoredWords.Contains(w));</w:t>
+        <w:t xml:space="preserve">            .</w:t>
+      </w:r>
+      <w:proofErr w:type="gramStart"/>
+      <w:r>
+        <w:rPr>
+          <w:rFonts w:ascii="Consolas" w:hAnsi="Consolas" w:cs="Cascadia Mono"/>
+          <w:color w:val="000000"/>
+          <w:sz w:val="18"/>
+          <w:szCs w:val="19"/>
+          <w:highlight w:val="white"/>
+          <w:lang w:val="en-US"/>
+        </w:rPr>
+        <w:t>Where(</w:t>
+      </w:r>
+      <w:proofErr w:type="gramEnd"/>
+      <w:r>
+        <w:rPr>
+          <w:rFonts w:ascii="Consolas" w:hAnsi="Consolas" w:cs="Cascadia Mono"/>
+          <w:color w:val="000000"/>
+          <w:sz w:val="18"/>
+          <w:szCs w:val="19"/>
+          <w:highlight w:val="white"/>
+          <w:lang w:val="en-US"/>
+        </w:rPr>
+        <w:t>w =&gt; !ignoredWords.Contains(w));</w:t>
       </w:r>
     </w:p>
     <w:p>
@@ -18590,6 +19044,7 @@
           <w:lang w:val="en-US"/>
         </w:rPr>
       </w:pPr>
+      <w:proofErr w:type="gramStart"/>
       <w:r>
         <w:rPr>
           <w:rFonts w:ascii="Consolas" w:hAnsi="Consolas"/>
@@ -18600,6 +19055,7 @@
         </w:rPr>
         <w:t>public</w:t>
       </w:r>
+      <w:proofErr w:type="gramEnd"/>
       <w:r>
         <w:rPr>
           <w:rFonts w:ascii="Consolas" w:hAnsi="Consolas"/>
@@ -18820,6 +19276,7 @@
         </w:rPr>
         <w:t xml:space="preserve">    </w:t>
       </w:r>
+      <w:proofErr w:type="gramStart"/>
       <w:r>
         <w:rPr>
           <w:rFonts w:ascii="Consolas" w:hAnsi="Consolas"/>
@@ -18830,6 +19287,7 @@
         </w:rPr>
         <w:t>return</w:t>
       </w:r>
+      <w:proofErr w:type="gramEnd"/>
       <w:r>
         <w:rPr>
           <w:rFonts w:ascii="Consolas" w:hAnsi="Consolas"/>
@@ -18885,6 +19343,7 @@
         </w:rPr>
         <w:t>.</w:t>
       </w:r>
+      <w:proofErr w:type="gramStart"/>
       <w:r>
         <w:rPr>
           <w:rFonts w:ascii="Consolas" w:hAnsi="Consolas"/>
@@ -18905,6 +19364,7 @@
         </w:rPr>
         <w:t>(</w:t>
       </w:r>
+      <w:proofErr w:type="gramEnd"/>
       <w:r>
         <w:rPr>
           <w:rFonts w:ascii="Consolas" w:hAnsi="Consolas"/>
@@ -18989,6 +19449,7 @@
         </w:rPr>
         <w:t xml:space="preserve">        </w:t>
       </w:r>
+      <w:proofErr w:type="gramStart"/>
       <w:r>
         <w:rPr>
           <w:rFonts w:ascii="Consolas" w:hAnsi="Consolas"/>
@@ -19007,6 +19468,7 @@
         </w:rPr>
         <w:t>Take</w:t>
       </w:r>
+      <w:proofErr w:type="gramEnd"/>
       <w:r>
         <w:rPr>
           <w:rFonts w:ascii="Consolas" w:hAnsi="Consolas"/>
@@ -19057,6 +19519,7 @@
         </w:rPr>
         <w:t xml:space="preserve">        </w:t>
       </w:r>
+      <w:proofErr w:type="gramStart"/>
       <w:r>
         <w:rPr>
           <w:rFonts w:ascii="Consolas" w:hAnsi="Consolas"/>
@@ -19075,6 +19538,7 @@
         </w:rPr>
         <w:t>ToList</w:t>
       </w:r>
+      <w:proofErr w:type="gramEnd"/>
       <w:r>
         <w:rPr>
           <w:rFonts w:ascii="Consolas" w:hAnsi="Consolas"/>
@@ -19272,6 +19736,7 @@
         </w:rPr>
         <w:t xml:space="preserve">    </w:t>
       </w:r>
+      <w:proofErr w:type="gramStart"/>
       <w:r>
         <w:rPr>
           <w:rFonts w:ascii="Consolas" w:hAnsi="Consolas" w:cs="Cascadia Mono"/>
@@ -19283,6 +19748,7 @@
         </w:rPr>
         <w:t>private</w:t>
       </w:r>
+      <w:proofErr w:type="gramEnd"/>
       <w:r>
         <w:rPr>
           <w:rFonts w:ascii="Consolas" w:hAnsi="Consolas" w:cs="Cascadia Mono"/>
@@ -19550,6 +20016,7 @@
         </w:rPr>
         <w:t xml:space="preserve">        </w:t>
       </w:r>
+      <w:proofErr w:type="gramStart"/>
       <w:r>
         <w:rPr>
           <w:rFonts w:ascii="Consolas" w:hAnsi="Consolas" w:cs="Cascadia Mono"/>
@@ -19561,6 +20028,7 @@
         </w:rPr>
         <w:t>return</w:t>
       </w:r>
+      <w:proofErr w:type="gramEnd"/>
       <w:r>
         <w:rPr>
           <w:rFonts w:ascii="Consolas" w:hAnsi="Consolas" w:cs="Cascadia Mono"/>
@@ -19599,7 +20067,31 @@
           <w:highlight w:val="white"/>
           <w:lang w:val="en-US"/>
         </w:rPr>
-        <w:t xml:space="preserve">            .OrderByDescending(pair =&gt; pair.Value)</w:t>
+        <w:t xml:space="preserve">            .</w:t>
+      </w:r>
+      <w:proofErr w:type="gramStart"/>
+      <w:r>
+        <w:rPr>
+          <w:rFonts w:ascii="Consolas" w:hAnsi="Consolas" w:cs="Cascadia Mono"/>
+          <w:color w:val="000000"/>
+          <w:sz w:val="18"/>
+          <w:szCs w:val="19"/>
+          <w:highlight w:val="white"/>
+          <w:lang w:val="en-US"/>
+        </w:rPr>
+        <w:t>OrderByDescending(</w:t>
+      </w:r>
+      <w:proofErr w:type="gramEnd"/>
+      <w:r>
+        <w:rPr>
+          <w:rFonts w:ascii="Consolas" w:hAnsi="Consolas" w:cs="Cascadia Mono"/>
+          <w:color w:val="000000"/>
+          <w:sz w:val="18"/>
+          <w:szCs w:val="19"/>
+          <w:highlight w:val="white"/>
+          <w:lang w:val="en-US"/>
+        </w:rPr>
+        <w:t>pair =&gt; pair.Value)</w:t>
       </w:r>
     </w:p>
     <w:p>
@@ -19628,7 +20120,31 @@
           <w:highlight w:val="white"/>
           <w:lang w:val="en-US"/>
         </w:rPr>
-        <w:t xml:space="preserve">            .Take(count)</w:t>
+        <w:t xml:space="preserve">            .</w:t>
+      </w:r>
+      <w:proofErr w:type="gramStart"/>
+      <w:r>
+        <w:rPr>
+          <w:rFonts w:ascii="Consolas" w:hAnsi="Consolas" w:cs="Cascadia Mono"/>
+          <w:color w:val="000000"/>
+          <w:sz w:val="18"/>
+          <w:szCs w:val="19"/>
+          <w:highlight w:val="white"/>
+          <w:lang w:val="en-US"/>
+        </w:rPr>
+        <w:t>Take(</w:t>
+      </w:r>
+      <w:proofErr w:type="gramEnd"/>
+      <w:r>
+        <w:rPr>
+          <w:rFonts w:ascii="Consolas" w:hAnsi="Consolas" w:cs="Cascadia Mono"/>
+          <w:color w:val="000000"/>
+          <w:sz w:val="18"/>
+          <w:szCs w:val="19"/>
+          <w:highlight w:val="white"/>
+          <w:lang w:val="en-US"/>
+        </w:rPr>
+        <w:t>count)</w:t>
       </w:r>
     </w:p>
     <w:p>
@@ -19657,7 +20173,31 @@
           <w:highlight w:val="white"/>
           <w:lang w:val="en-US"/>
         </w:rPr>
-        <w:t xml:space="preserve">            .ToList();</w:t>
+        <w:t xml:space="preserve">            .</w:t>
+      </w:r>
+      <w:proofErr w:type="gramStart"/>
+      <w:r>
+        <w:rPr>
+          <w:rFonts w:ascii="Consolas" w:hAnsi="Consolas" w:cs="Cascadia Mono"/>
+          <w:color w:val="000000"/>
+          <w:sz w:val="18"/>
+          <w:szCs w:val="19"/>
+          <w:highlight w:val="white"/>
+          <w:lang w:val="en-US"/>
+        </w:rPr>
+        <w:t>ToList(</w:t>
+      </w:r>
+      <w:proofErr w:type="gramEnd"/>
+      <w:r>
+        <w:rPr>
+          <w:rFonts w:ascii="Consolas" w:hAnsi="Consolas" w:cs="Cascadia Mono"/>
+          <w:color w:val="000000"/>
+          <w:sz w:val="18"/>
+          <w:szCs w:val="19"/>
+          <w:highlight w:val="white"/>
+          <w:lang w:val="en-US"/>
+        </w:rPr>
+        <w:t>);</w:t>
       </w:r>
     </w:p>
     <w:p>
@@ -19735,6 +20275,7 @@
         </w:rPr>
         <w:t xml:space="preserve">    </w:t>
       </w:r>
+      <w:proofErr w:type="gramStart"/>
       <w:r>
         <w:rPr>
           <w:rFonts w:ascii="Consolas" w:hAnsi="Consolas" w:cs="Cascadia Mono"/>
@@ -19746,6 +20287,7 @@
         </w:rPr>
         <w:t>public</w:t>
       </w:r>
+      <w:proofErr w:type="gramEnd"/>
       <w:r>
         <w:rPr>
           <w:rFonts w:ascii="Consolas" w:hAnsi="Consolas" w:cs="Cascadia Mono"/>
@@ -19936,6 +20478,7 @@
         </w:rPr>
         <w:t xml:space="preserve">        </w:t>
       </w:r>
+      <w:proofErr w:type="gramStart"/>
       <w:r>
         <w:rPr>
           <w:rFonts w:ascii="Consolas" w:hAnsi="Consolas" w:cs="Cascadia Mono"/>
@@ -19947,6 +20490,7 @@
         </w:rPr>
         <w:t>return</w:t>
       </w:r>
+      <w:proofErr w:type="gramEnd"/>
       <w:r>
         <w:rPr>
           <w:rFonts w:ascii="Consolas" w:hAnsi="Consolas" w:cs="Cascadia Mono"/>
@@ -20155,6 +20699,7 @@
           <w:lang w:val="en-US"/>
         </w:rPr>
       </w:pPr>
+      <w:proofErr w:type="gramStart"/>
       <w:r>
         <w:rPr>
           <w:rFonts w:ascii="Consolas" w:hAnsi="Consolas" w:cs="Courier New"/>
@@ -20166,6 +20711,7 @@
         </w:rPr>
         <w:t>using</w:t>
       </w:r>
+      <w:proofErr w:type="gramEnd"/>
       <w:r>
         <w:rPr>
           <w:rFonts w:ascii="Consolas" w:hAnsi="Consolas" w:cs="Courier New"/>
@@ -20213,6 +20759,7 @@
           <w:lang w:val="en-US"/>
         </w:rPr>
       </w:pPr>
+      <w:proofErr w:type="gramStart"/>
       <w:r>
         <w:rPr>
           <w:rFonts w:ascii="Consolas" w:hAnsi="Consolas" w:cs="Courier New"/>
@@ -20224,6 +20771,7 @@
         </w:rPr>
         <w:t>var</w:t>
       </w:r>
+      <w:proofErr w:type="gramEnd"/>
       <w:r>
         <w:rPr>
           <w:rFonts w:ascii="Consolas" w:hAnsi="Consolas" w:cs="Courier New"/>
@@ -20306,8 +20854,21 @@
           <w:highlight w:val="white"/>
           <w:lang w:val="en-US"/>
         </w:rPr>
-        <w:t xml:space="preserve">    .AddComparer(</w:t>
-      </w:r>
+        <w:t xml:space="preserve">    .</w:t>
+      </w:r>
+      <w:proofErr w:type="gramStart"/>
+      <w:r>
+        <w:rPr>
+          <w:rFonts w:ascii="Consolas" w:hAnsi="Consolas" w:cs="Courier New"/>
+          <w:color w:val="000000"/>
+          <w:sz w:val="18"/>
+          <w:szCs w:val="18"/>
+          <w:highlight w:val="white"/>
+          <w:lang w:val="en-US"/>
+        </w:rPr>
+        <w:t>AddComparer(</w:t>
+      </w:r>
+      <w:proofErr w:type="gramEnd"/>
       <w:r>
         <w:rPr>
           <w:rFonts w:ascii="Consolas" w:hAnsi="Consolas" w:cs="Courier New"/>
@@ -20357,8 +20918,21 @@
           <w:highlight w:val="white"/>
           <w:lang w:val="en-US"/>
         </w:rPr>
-        <w:t xml:space="preserve">    .AddIgnoreWords(</w:t>
-      </w:r>
+        <w:t xml:space="preserve">    .</w:t>
+      </w:r>
+      <w:proofErr w:type="gramStart"/>
+      <w:r>
+        <w:rPr>
+          <w:rFonts w:ascii="Consolas" w:hAnsi="Consolas" w:cs="Courier New"/>
+          <w:color w:val="000000"/>
+          <w:sz w:val="18"/>
+          <w:szCs w:val="18"/>
+          <w:highlight w:val="white"/>
+          <w:lang w:val="en-US"/>
+        </w:rPr>
+        <w:t>AddIgnoreWords(</w:t>
+      </w:r>
+      <w:proofErr w:type="gramEnd"/>
       <w:r>
         <w:rPr>
           <w:rFonts w:ascii="Consolas" w:hAnsi="Consolas" w:cs="Courier New"/>
@@ -20417,6 +20991,7 @@
           <w:lang w:val="en-US"/>
         </w:rPr>
       </w:pPr>
+      <w:proofErr w:type="gramStart"/>
       <w:r>
         <w:rPr>
           <w:rFonts w:ascii="Consolas" w:hAnsi="Consolas" w:cs="Courier New"/>
@@ -20428,6 +21003,7 @@
         </w:rPr>
         <w:t>await</w:t>
       </w:r>
+      <w:proofErr w:type="gramEnd"/>
       <w:r>
         <w:rPr>
           <w:rFonts w:ascii="Consolas" w:hAnsi="Consolas" w:cs="Courier New"/>
@@ -20561,6 +21137,7 @@
           <w:lang w:val="en-US"/>
         </w:rPr>
       </w:pPr>
+      <w:proofErr w:type="gramStart"/>
       <w:r>
         <w:rPr>
           <w:rFonts w:ascii="Consolas" w:hAnsi="Consolas" w:cs="Courier New"/>
@@ -20572,6 +21149,7 @@
         </w:rPr>
         <w:t>var</w:t>
       </w:r>
+      <w:proofErr w:type="gramEnd"/>
       <w:r>
         <w:rPr>
           <w:rFonts w:ascii="Consolas" w:hAnsi="Consolas" w:cs="Courier New"/>
@@ -20615,6 +21193,7 @@
           <w:lang w:val="en-US"/>
         </w:rPr>
       </w:pPr>
+      <w:proofErr w:type="gramStart"/>
       <w:r>
         <w:rPr>
           <w:rFonts w:ascii="Consolas" w:hAnsi="Consolas" w:cs="Courier New"/>
@@ -20635,7 +21214,19 @@
           <w:highlight w:val="white"/>
           <w:lang w:val="en-US"/>
         </w:rPr>
-        <w:t>.ReadKey();</w:t>
+        <w:t>.ReadKey(</w:t>
+      </w:r>
+      <w:proofErr w:type="gramEnd"/>
+      <w:r>
+        <w:rPr>
+          <w:rFonts w:ascii="Consolas" w:hAnsi="Consolas" w:cs="Courier New"/>
+          <w:color w:val="000000"/>
+          <w:sz w:val="18"/>
+          <w:szCs w:val="18"/>
+          <w:highlight w:val="white"/>
+          <w:lang w:val="en-US"/>
+        </w:rPr>
+        <w:t>);</w:t>
       </w:r>
     </w:p>
     <w:p>
@@ -20669,6 +21260,7 @@
           <w:lang w:val="en-US"/>
         </w:rPr>
       </w:pPr>
+      <w:proofErr w:type="gramStart"/>
       <w:r>
         <w:rPr>
           <w:rFonts w:ascii="Consolas" w:hAnsi="Consolas" w:cs="Courier New"/>
@@ -20680,6 +21272,7 @@
         </w:rPr>
         <w:t>namespace</w:t>
       </w:r>
+      <w:proofErr w:type="gramEnd"/>
       <w:r>
         <w:rPr>
           <w:rFonts w:ascii="Consolas" w:hAnsi="Consolas" w:cs="Courier New"/>
@@ -20727,6 +21320,7 @@
           <w:lang w:val="en-US"/>
         </w:rPr>
       </w:pPr>
+      <w:proofErr w:type="gramStart"/>
       <w:r>
         <w:rPr>
           <w:rFonts w:ascii="Consolas" w:hAnsi="Consolas" w:cs="Courier New"/>
@@ -20738,6 +21332,7 @@
         </w:rPr>
         <w:t>public</w:t>
       </w:r>
+      <w:proofErr w:type="gramEnd"/>
       <w:r>
         <w:rPr>
           <w:rFonts w:ascii="Consolas" w:hAnsi="Consolas" w:cs="Courier New"/>
@@ -20862,6 +21457,7 @@
         </w:rPr>
         <w:t xml:space="preserve">    </w:t>
       </w:r>
+      <w:proofErr w:type="gramStart"/>
       <w:r>
         <w:rPr>
           <w:rFonts w:ascii="Consolas" w:hAnsi="Consolas" w:cs="Courier New"/>
@@ -20873,6 +21469,7 @@
         </w:rPr>
         <w:t>public</w:t>
       </w:r>
+      <w:proofErr w:type="gramEnd"/>
       <w:r>
         <w:rPr>
           <w:rFonts w:ascii="Consolas" w:hAnsi="Consolas" w:cs="Courier New"/>
@@ -21382,17 +21979,29 @@
           <w:sz w:val="18"/>
           <w:szCs w:val="18"/>
           <w:highlight w:val="white"/>
-        </w:rPr>
-      </w:pPr>
-      <w:r>
-        <w:rPr>
-          <w:rFonts w:ascii="Consolas" w:hAnsi="Consolas" w:cs="Courier New"/>
-          <w:color w:val="000000"/>
-          <w:sz w:val="18"/>
-          <w:szCs w:val="18"/>
-          <w:highlight w:val="white"/>
-        </w:rPr>
-        <w:t xml:space="preserve">    };</w:t>
+          <w:lang w:val="en-US"/>
+        </w:rPr>
+      </w:pPr>
+      <w:r>
+        <w:rPr>
+          <w:rFonts w:ascii="Consolas" w:hAnsi="Consolas" w:cs="Courier New"/>
+          <w:color w:val="000000"/>
+          <w:sz w:val="18"/>
+          <w:szCs w:val="18"/>
+          <w:highlight w:val="white"/>
+        </w:rPr>
+        <w:t xml:space="preserve">    </w:t>
+      </w:r>
+      <w:r>
+        <w:rPr>
+          <w:rFonts w:ascii="Consolas" w:hAnsi="Consolas" w:cs="Courier New"/>
+          <w:color w:val="000000"/>
+          <w:sz w:val="18"/>
+          <w:szCs w:val="18"/>
+          <w:highlight w:val="white"/>
+          <w:lang w:val="en-US"/>
+        </w:rPr>
+        <w:t>};</w:t>
       </w:r>
     </w:p>
     <w:p>
@@ -21405,15 +22014,17 @@
           <w:color w:val="000000"/>
           <w:sz w:val="18"/>
           <w:szCs w:val="18"/>
-        </w:rPr>
-      </w:pPr>
-      <w:r>
-        <w:rPr>
-          <w:rFonts w:ascii="Consolas" w:hAnsi="Consolas" w:cs="Courier New"/>
-          <w:color w:val="000000"/>
-          <w:sz w:val="18"/>
-          <w:szCs w:val="18"/>
-          <w:highlight w:val="white"/>
+          <w:lang w:val="en-US"/>
+        </w:rPr>
+      </w:pPr>
+      <w:r>
+        <w:rPr>
+          <w:rFonts w:ascii="Consolas" w:hAnsi="Consolas" w:cs="Courier New"/>
+          <w:color w:val="000000"/>
+          <w:sz w:val="18"/>
+          <w:szCs w:val="18"/>
+          <w:highlight w:val="white"/>
+          <w:lang w:val="en-US"/>
         </w:rPr>
         <w:t>}</w:t>
       </w:r>
@@ -21428,6 +22039,7 @@
           <w:color w:val="000000"/>
           <w:sz w:val="18"/>
           <w:szCs w:val="18"/>
+          <w:lang w:val="en-US"/>
         </w:rPr>
       </w:pPr>
     </w:p>
@@ -21448,6 +22060,7 @@
           <w:lang w:val="en-US"/>
         </w:rPr>
       </w:pPr>
+      <w:proofErr w:type="gramStart"/>
       <w:r>
         <w:rPr>
           <w:rFonts w:ascii="Consolas" w:hAnsi="Consolas" w:cs="Courier New"/>
@@ -21459,6 +22072,7 @@
         </w:rPr>
         <w:t>using</w:t>
       </w:r>
+      <w:proofErr w:type="gramEnd"/>
       <w:r>
         <w:rPr>
           <w:rFonts w:ascii="Consolas" w:hAnsi="Consolas" w:cs="Courier New"/>
@@ -21488,6 +22102,7 @@
           <w:lang w:val="en-US"/>
         </w:rPr>
       </w:pPr>
+      <w:proofErr w:type="gramStart"/>
       <w:r>
         <w:rPr>
           <w:rFonts w:ascii="Consolas" w:hAnsi="Consolas" w:cs="Courier New"/>
@@ -21499,6 +22114,7 @@
         </w:rPr>
         <w:t>using</w:t>
       </w:r>
+      <w:proofErr w:type="gramEnd"/>
       <w:r>
         <w:rPr>
           <w:rFonts w:ascii="Consolas" w:hAnsi="Consolas" w:cs="Courier New"/>
@@ -21546,6 +22162,7 @@
           <w:lang w:val="en-US"/>
         </w:rPr>
       </w:pPr>
+      <w:proofErr w:type="gramStart"/>
       <w:r>
         <w:rPr>
           <w:rFonts w:ascii="Consolas" w:hAnsi="Consolas" w:cs="Courier New"/>
@@ -21557,6 +22174,7 @@
         </w:rPr>
         <w:t>namespace</w:t>
       </w:r>
+      <w:proofErr w:type="gramEnd"/>
       <w:r>
         <w:rPr>
           <w:rFonts w:ascii="Consolas" w:hAnsi="Consolas" w:cs="Courier New"/>
@@ -21604,6 +22222,7 @@
           <w:lang w:val="en-US"/>
         </w:rPr>
       </w:pPr>
+      <w:proofErr w:type="gramStart"/>
       <w:r>
         <w:rPr>
           <w:rFonts w:ascii="Consolas" w:hAnsi="Consolas" w:cs="Courier New"/>
@@ -21615,6 +22234,7 @@
         </w:rPr>
         <w:t>public</w:t>
       </w:r>
+      <w:proofErr w:type="gramEnd"/>
       <w:r>
         <w:rPr>
           <w:rFonts w:ascii="Consolas" w:hAnsi="Consolas" w:cs="Courier New"/>
@@ -21717,6 +22337,7 @@
         </w:rPr>
         <w:t xml:space="preserve">    </w:t>
       </w:r>
+      <w:proofErr w:type="gramStart"/>
       <w:r>
         <w:rPr>
           <w:rFonts w:ascii="Consolas" w:hAnsi="Consolas" w:cs="Courier New"/>
@@ -21728,6 +22349,7 @@
         </w:rPr>
         <w:t>private</w:t>
       </w:r>
+      <w:proofErr w:type="gramEnd"/>
       <w:r>
         <w:rPr>
           <w:rFonts w:ascii="Consolas" w:hAnsi="Consolas" w:cs="Courier New"/>
@@ -21830,6 +22452,7 @@
         </w:rPr>
         <w:t xml:space="preserve">    </w:t>
       </w:r>
+      <w:proofErr w:type="gramStart"/>
       <w:r>
         <w:rPr>
           <w:rFonts w:ascii="Consolas" w:hAnsi="Consolas" w:cs="Courier New"/>
@@ -21841,6 +22464,7 @@
         </w:rPr>
         <w:t>private</w:t>
       </w:r>
+      <w:proofErr w:type="gramEnd"/>
       <w:r>
         <w:rPr>
           <w:rFonts w:ascii="Consolas" w:hAnsi="Consolas" w:cs="Courier New"/>
@@ -21965,6 +22589,7 @@
         </w:rPr>
         <w:t xml:space="preserve">    </w:t>
       </w:r>
+      <w:proofErr w:type="gramStart"/>
       <w:r>
         <w:rPr>
           <w:rFonts w:ascii="Consolas" w:hAnsi="Consolas" w:cs="Courier New"/>
@@ -21976,6 +22601,7 @@
         </w:rPr>
         <w:t>public</w:t>
       </w:r>
+      <w:proofErr w:type="gramEnd"/>
       <w:r>
         <w:rPr>
           <w:rFonts w:ascii="Consolas" w:hAnsi="Consolas" w:cs="Courier New"/>
@@ -22029,7 +22655,19 @@
           <w:highlight w:val="white"/>
           <w:lang w:val="en-US"/>
         </w:rPr>
-        <w:t xml:space="preserve">&gt;? Comparer { </w:t>
+        <w:t xml:space="preserve">&gt;? Comparer </w:t>
+      </w:r>
+      <w:proofErr w:type="gramStart"/>
+      <w:r>
+        <w:rPr>
+          <w:rFonts w:ascii="Consolas" w:hAnsi="Consolas" w:cs="Courier New"/>
+          <w:color w:val="000000"/>
+          <w:sz w:val="18"/>
+          <w:szCs w:val="18"/>
+          <w:highlight w:val="white"/>
+          <w:lang w:val="en-US"/>
+        </w:rPr>
+        <w:t xml:space="preserve">{ </w:t>
       </w:r>
       <w:r>
         <w:rPr>
@@ -22042,6 +22680,7 @@
         </w:rPr>
         <w:t>get</w:t>
       </w:r>
+      <w:proofErr w:type="gramEnd"/>
       <w:r>
         <w:rPr>
           <w:rFonts w:ascii="Consolas" w:hAnsi="Consolas" w:cs="Courier New"/>
@@ -22100,6 +22739,7 @@
         </w:rPr>
         <w:t xml:space="preserve">    </w:t>
       </w:r>
+      <w:proofErr w:type="gramStart"/>
       <w:r>
         <w:rPr>
           <w:rFonts w:ascii="Consolas" w:hAnsi="Consolas" w:cs="Courier New"/>
@@ -22111,6 +22751,7 @@
         </w:rPr>
         <w:t>public</w:t>
       </w:r>
+      <w:proofErr w:type="gramEnd"/>
       <w:r>
         <w:rPr>
           <w:rFonts w:ascii="Consolas" w:hAnsi="Consolas" w:cs="Courier New"/>
@@ -22200,7 +22841,31 @@
           <w:highlight w:val="white"/>
           <w:lang w:val="en-US"/>
         </w:rPr>
-        <w:t xml:space="preserve">        allWordCounts = </w:t>
+        <w:t xml:space="preserve">        </w:t>
+      </w:r>
+      <w:proofErr w:type="gramStart"/>
+      <w:r>
+        <w:rPr>
+          <w:rFonts w:ascii="Consolas" w:hAnsi="Consolas" w:cs="Courier New"/>
+          <w:color w:val="000000"/>
+          <w:sz w:val="18"/>
+          <w:szCs w:val="18"/>
+          <w:highlight w:val="white"/>
+          <w:lang w:val="en-US"/>
+        </w:rPr>
+        <w:t>allWordCounts</w:t>
+      </w:r>
+      <w:proofErr w:type="gramEnd"/>
+      <w:r>
+        <w:rPr>
+          <w:rFonts w:ascii="Consolas" w:hAnsi="Consolas" w:cs="Courier New"/>
+          <w:color w:val="000000"/>
+          <w:sz w:val="18"/>
+          <w:szCs w:val="18"/>
+          <w:highlight w:val="white"/>
+          <w:lang w:val="en-US"/>
+        </w:rPr>
+        <w:t xml:space="preserve"> = </w:t>
       </w:r>
       <w:r>
         <w:rPr>
@@ -22368,7 +23033,31 @@
           <w:highlight w:val="white"/>
           <w:lang w:val="en-US"/>
         </w:rPr>
-        <w:t xml:space="preserve">        ignoredWords = </w:t>
+        <w:t xml:space="preserve">        </w:t>
+      </w:r>
+      <w:proofErr w:type="gramStart"/>
+      <w:r>
+        <w:rPr>
+          <w:rFonts w:ascii="Consolas" w:hAnsi="Consolas" w:cs="Courier New"/>
+          <w:color w:val="000000"/>
+          <w:sz w:val="18"/>
+          <w:szCs w:val="18"/>
+          <w:highlight w:val="white"/>
+          <w:lang w:val="en-US"/>
+        </w:rPr>
+        <w:t>ignoredWords</w:t>
+      </w:r>
+      <w:proofErr w:type="gramEnd"/>
+      <w:r>
+        <w:rPr>
+          <w:rFonts w:ascii="Consolas" w:hAnsi="Consolas" w:cs="Courier New"/>
+          <w:color w:val="000000"/>
+          <w:sz w:val="18"/>
+          <w:szCs w:val="18"/>
+          <w:highlight w:val="white"/>
+          <w:lang w:val="en-US"/>
+        </w:rPr>
+        <w:t xml:space="preserve"> = </w:t>
       </w:r>
       <w:r>
         <w:rPr>
@@ -22468,6 +23157,7 @@
         </w:rPr>
         <w:t xml:space="preserve">    </w:t>
       </w:r>
+      <w:proofErr w:type="gramStart"/>
       <w:r>
         <w:rPr>
           <w:rFonts w:ascii="Consolas" w:hAnsi="Consolas" w:cs="Courier New"/>
@@ -22479,6 +23169,7 @@
         </w:rPr>
         <w:t>public</w:t>
       </w:r>
+      <w:proofErr w:type="gramEnd"/>
       <w:r>
         <w:rPr>
           <w:rFonts w:ascii="Consolas" w:hAnsi="Consolas" w:cs="Courier New"/>
@@ -22612,7 +23303,31 @@
           <w:highlight w:val="white"/>
           <w:lang w:val="en-US"/>
         </w:rPr>
-        <w:t xml:space="preserve">        allWordCounts = </w:t>
+        <w:t xml:space="preserve">        </w:t>
+      </w:r>
+      <w:proofErr w:type="gramStart"/>
+      <w:r>
+        <w:rPr>
+          <w:rFonts w:ascii="Consolas" w:hAnsi="Consolas" w:cs="Courier New"/>
+          <w:color w:val="000000"/>
+          <w:sz w:val="18"/>
+          <w:szCs w:val="18"/>
+          <w:highlight w:val="white"/>
+          <w:lang w:val="en-US"/>
+        </w:rPr>
+        <w:t>allWordCounts</w:t>
+      </w:r>
+      <w:proofErr w:type="gramEnd"/>
+      <w:r>
+        <w:rPr>
+          <w:rFonts w:ascii="Consolas" w:hAnsi="Consolas" w:cs="Courier New"/>
+          <w:color w:val="000000"/>
+          <w:sz w:val="18"/>
+          <w:szCs w:val="18"/>
+          <w:highlight w:val="white"/>
+          <w:lang w:val="en-US"/>
+        </w:rPr>
+        <w:t xml:space="preserve"> = </w:t>
       </w:r>
       <w:r>
         <w:rPr>
@@ -22731,6 +23446,7 @@
         </w:rPr>
         <w:t xml:space="preserve">        </w:t>
       </w:r>
+      <w:proofErr w:type="gramStart"/>
       <w:r>
         <w:rPr>
           <w:rFonts w:ascii="Consolas" w:hAnsi="Consolas" w:cs="Courier New"/>
@@ -22742,6 +23458,7 @@
         </w:rPr>
         <w:t>return</w:t>
       </w:r>
+      <w:proofErr w:type="gramEnd"/>
       <w:r>
         <w:rPr>
           <w:rFonts w:ascii="Consolas" w:hAnsi="Consolas" w:cs="Courier New"/>
@@ -22851,6 +23568,7 @@
         </w:rPr>
         <w:t xml:space="preserve">    </w:t>
       </w:r>
+      <w:proofErr w:type="gramStart"/>
       <w:r>
         <w:rPr>
           <w:rFonts w:ascii="Consolas" w:hAnsi="Consolas" w:cs="Courier New"/>
@@ -22862,6 +23580,7 @@
         </w:rPr>
         <w:t>public</w:t>
       </w:r>
+      <w:proofErr w:type="gramEnd"/>
       <w:r>
         <w:rPr>
           <w:rFonts w:ascii="Consolas" w:hAnsi="Consolas" w:cs="Courier New"/>
@@ -23048,6 +23767,7 @@
         </w:rPr>
         <w:t xml:space="preserve">        </w:t>
       </w:r>
+      <w:proofErr w:type="gramStart"/>
       <w:r>
         <w:rPr>
           <w:rFonts w:ascii="Consolas" w:hAnsi="Consolas" w:cs="Courier New"/>
@@ -23059,6 +23779,7 @@
         </w:rPr>
         <w:t>return</w:t>
       </w:r>
+      <w:proofErr w:type="gramEnd"/>
       <w:r>
         <w:rPr>
           <w:rFonts w:ascii="Consolas" w:hAnsi="Consolas" w:cs="Courier New"/>
@@ -23168,6 +23889,7 @@
         </w:rPr>
         <w:t xml:space="preserve">    </w:t>
       </w:r>
+      <w:proofErr w:type="gramStart"/>
       <w:r>
         <w:rPr>
           <w:rFonts w:ascii="Consolas" w:hAnsi="Consolas" w:cs="Courier New"/>
@@ -23179,6 +23901,7 @@
         </w:rPr>
         <w:t>public</w:t>
       </w:r>
+      <w:proofErr w:type="gramEnd"/>
       <w:r>
         <w:rPr>
           <w:rFonts w:ascii="Consolas" w:hAnsi="Consolas" w:cs="Courier New"/>
@@ -23314,6 +24037,7 @@
         </w:rPr>
         <w:t xml:space="preserve">        </w:t>
       </w:r>
+      <w:proofErr w:type="gramStart"/>
       <w:r>
         <w:rPr>
           <w:rFonts w:ascii="Consolas" w:hAnsi="Consolas" w:cs="Courier New"/>
@@ -23325,6 +24049,7 @@
         </w:rPr>
         <w:t>var</w:t>
       </w:r>
+      <w:proofErr w:type="gramEnd"/>
       <w:r>
         <w:rPr>
           <w:rFonts w:ascii="Consolas" w:hAnsi="Consolas" w:cs="Courier New"/>
@@ -23407,7 +24132,31 @@
           <w:highlight w:val="white"/>
           <w:lang w:val="en-US"/>
         </w:rPr>
-        <w:t xml:space="preserve">        allWordCounts.Clear();</w:t>
+        <w:t xml:space="preserve">        </w:t>
+      </w:r>
+      <w:proofErr w:type="gramStart"/>
+      <w:r>
+        <w:rPr>
+          <w:rFonts w:ascii="Consolas" w:hAnsi="Consolas" w:cs="Courier New"/>
+          <w:color w:val="000000"/>
+          <w:sz w:val="18"/>
+          <w:szCs w:val="18"/>
+          <w:highlight w:val="white"/>
+          <w:lang w:val="en-US"/>
+        </w:rPr>
+        <w:t>allWordCounts.Clear(</w:t>
+      </w:r>
+      <w:proofErr w:type="gramEnd"/>
+      <w:r>
+        <w:rPr>
+          <w:rFonts w:ascii="Consolas" w:hAnsi="Consolas" w:cs="Courier New"/>
+          <w:color w:val="000000"/>
+          <w:sz w:val="18"/>
+          <w:szCs w:val="18"/>
+          <w:highlight w:val="white"/>
+          <w:lang w:val="en-US"/>
+        </w:rPr>
+        <w:t>);</w:t>
       </w:r>
     </w:p>
     <w:p>
@@ -23456,6 +24205,7 @@
         </w:rPr>
         <w:t xml:space="preserve">        </w:t>
       </w:r>
+      <w:proofErr w:type="gramStart"/>
       <w:r>
         <w:rPr>
           <w:rFonts w:ascii="Consolas" w:hAnsi="Consolas" w:cs="Courier New"/>
@@ -23467,6 +24217,7 @@
         </w:rPr>
         <w:t>var</w:t>
       </w:r>
+      <w:proofErr w:type="gramEnd"/>
       <w:r>
         <w:rPr>
           <w:rFonts w:ascii="Consolas" w:hAnsi="Consolas" w:cs="Courier New"/>
@@ -23507,6 +24258,7 @@
         </w:rPr>
         <w:t xml:space="preserve">        </w:t>
       </w:r>
+      <w:proofErr w:type="gramStart"/>
       <w:r>
         <w:rPr>
           <w:rFonts w:ascii="Consolas" w:hAnsi="Consolas" w:cs="Courier New"/>
@@ -23518,6 +24270,7 @@
         </w:rPr>
         <w:t>await</w:t>
       </w:r>
+      <w:proofErr w:type="gramEnd"/>
       <w:r>
         <w:rPr>
           <w:rFonts w:ascii="Consolas" w:hAnsi="Consolas" w:cs="Courier New"/>
@@ -23627,6 +24380,7 @@
         </w:rPr>
         <w:t xml:space="preserve">    </w:t>
       </w:r>
+      <w:proofErr w:type="gramStart"/>
       <w:r>
         <w:rPr>
           <w:rFonts w:ascii="Consolas" w:hAnsi="Consolas" w:cs="Courier New"/>
@@ -23638,6 +24392,7 @@
         </w:rPr>
         <w:t>private</w:t>
       </w:r>
+      <w:proofErr w:type="gramEnd"/>
       <w:r>
         <w:rPr>
           <w:rFonts w:ascii="Consolas" w:hAnsi="Consolas" w:cs="Courier New"/>
@@ -23839,6 +24594,7 @@
         </w:rPr>
         <w:t xml:space="preserve">        </w:t>
       </w:r>
+      <w:proofErr w:type="gramStart"/>
       <w:r>
         <w:rPr>
           <w:rFonts w:ascii="Consolas" w:hAnsi="Consolas" w:cs="Courier New"/>
@@ -23850,6 +24606,7 @@
         </w:rPr>
         <w:t>var</w:t>
       </w:r>
+      <w:proofErr w:type="gramEnd"/>
       <w:r>
         <w:rPr>
           <w:rFonts w:ascii="Consolas" w:hAnsi="Consolas" w:cs="Courier New"/>
@@ -23934,6 +24691,7 @@
         </w:rPr>
         <w:t xml:space="preserve">        </w:t>
       </w:r>
+      <w:proofErr w:type="gramStart"/>
       <w:r>
         <w:rPr>
           <w:rFonts w:ascii="Consolas" w:hAnsi="Consolas" w:cs="Courier New"/>
@@ -23945,6 +24703,7 @@
         </w:rPr>
         <w:t>var</w:t>
       </w:r>
+      <w:proofErr w:type="gramEnd"/>
       <w:r>
         <w:rPr>
           <w:rFonts w:ascii="Consolas" w:hAnsi="Consolas" w:cs="Courier New"/>
@@ -24003,6 +24762,7 @@
         </w:rPr>
         <w:t xml:space="preserve">        </w:t>
       </w:r>
+      <w:proofErr w:type="gramStart"/>
       <w:r>
         <w:rPr>
           <w:rFonts w:ascii="Consolas" w:hAnsi="Consolas" w:cs="Courier New"/>
@@ -24014,6 +24774,7 @@
         </w:rPr>
         <w:t>foreach</w:t>
       </w:r>
+      <w:proofErr w:type="gramEnd"/>
       <w:r>
         <w:rPr>
           <w:rFonts w:ascii="Consolas" w:hAnsi="Consolas" w:cs="Courier New"/>
@@ -24138,6 +24899,7 @@
         </w:rPr>
         <w:t xml:space="preserve">            </w:t>
       </w:r>
+      <w:proofErr w:type="gramStart"/>
       <w:r>
         <w:rPr>
           <w:rFonts w:ascii="Consolas" w:hAnsi="Consolas" w:cs="Courier New"/>
@@ -24149,6 +24911,7 @@
         </w:rPr>
         <w:t>if</w:t>
       </w:r>
+      <w:proofErr w:type="gramEnd"/>
       <w:r>
         <w:rPr>
           <w:rFonts w:ascii="Consolas" w:hAnsi="Consolas" w:cs="Courier New"/>
@@ -24216,7 +24979,31 @@
           <w:highlight w:val="white"/>
           <w:lang w:val="en-US"/>
         </w:rPr>
-        <w:t xml:space="preserve">                wordCounts[word]++;</w:t>
+        <w:t xml:space="preserve">                </w:t>
+      </w:r>
+      <w:proofErr w:type="gramStart"/>
+      <w:r>
+        <w:rPr>
+          <w:rFonts w:ascii="Consolas" w:hAnsi="Consolas" w:cs="Courier New"/>
+          <w:color w:val="000000"/>
+          <w:sz w:val="18"/>
+          <w:szCs w:val="18"/>
+          <w:highlight w:val="white"/>
+          <w:lang w:val="en-US"/>
+        </w:rPr>
+        <w:t>wordCounts[</w:t>
+      </w:r>
+      <w:proofErr w:type="gramEnd"/>
+      <w:r>
+        <w:rPr>
+          <w:rFonts w:ascii="Consolas" w:hAnsi="Consolas" w:cs="Courier New"/>
+          <w:color w:val="000000"/>
+          <w:sz w:val="18"/>
+          <w:szCs w:val="18"/>
+          <w:highlight w:val="white"/>
+          <w:lang w:val="en-US"/>
+        </w:rPr>
+        <w:t>word]++;</w:t>
       </w:r>
     </w:p>
     <w:p>
@@ -24276,6 +25063,7 @@
         </w:rPr>
         <w:t xml:space="preserve">            </w:t>
       </w:r>
+      <w:proofErr w:type="gramStart"/>
       <w:r>
         <w:rPr>
           <w:rFonts w:ascii="Consolas" w:hAnsi="Consolas" w:cs="Courier New"/>
@@ -24287,6 +25075,7 @@
         </w:rPr>
         <w:t>else</w:t>
       </w:r>
+      <w:proofErr w:type="gramEnd"/>
     </w:p>
     <w:p>
       <w:pPr>
@@ -24343,7 +25132,31 @@
           <w:highlight w:val="white"/>
           <w:lang w:val="en-US"/>
         </w:rPr>
-        <w:t xml:space="preserve">                wordCounts[word] = 1;</w:t>
+        <w:t xml:space="preserve">                </w:t>
+      </w:r>
+      <w:proofErr w:type="gramStart"/>
+      <w:r>
+        <w:rPr>
+          <w:rFonts w:ascii="Consolas" w:hAnsi="Consolas" w:cs="Courier New"/>
+          <w:color w:val="000000"/>
+          <w:sz w:val="18"/>
+          <w:szCs w:val="18"/>
+          <w:highlight w:val="white"/>
+          <w:lang w:val="en-US"/>
+        </w:rPr>
+        <w:t>wordCounts[</w:t>
+      </w:r>
+      <w:proofErr w:type="gramEnd"/>
+      <w:r>
+        <w:rPr>
+          <w:rFonts w:ascii="Consolas" w:hAnsi="Consolas" w:cs="Courier New"/>
+          <w:color w:val="000000"/>
+          <w:sz w:val="18"/>
+          <w:szCs w:val="18"/>
+          <w:highlight w:val="white"/>
+          <w:lang w:val="en-US"/>
+        </w:rPr>
+        <w:t>word] = 1;</w:t>
       </w:r>
     </w:p>
     <w:p>
@@ -24480,6 +25293,7 @@
         </w:rPr>
         <w:t xml:space="preserve">    </w:t>
       </w:r>
+      <w:proofErr w:type="gramStart"/>
       <w:r>
         <w:rPr>
           <w:rFonts w:ascii="Consolas" w:hAnsi="Consolas" w:cs="Courier New"/>
@@ -24491,6 +25305,7 @@
         </w:rPr>
         <w:t>private</w:t>
       </w:r>
+      <w:proofErr w:type="gramEnd"/>
       <w:r>
         <w:rPr>
           <w:rFonts w:ascii="Consolas" w:hAnsi="Consolas" w:cs="Courier New"/>
@@ -24626,6 +25441,7 @@
         </w:rPr>
         <w:t xml:space="preserve">        </w:t>
       </w:r>
+      <w:proofErr w:type="gramStart"/>
       <w:r>
         <w:rPr>
           <w:rFonts w:ascii="Consolas" w:hAnsi="Consolas" w:cs="Courier New"/>
@@ -24637,6 +25453,7 @@
         </w:rPr>
         <w:t>var</w:t>
       </w:r>
+      <w:proofErr w:type="gramEnd"/>
       <w:r>
         <w:rPr>
           <w:rFonts w:ascii="Consolas" w:hAnsi="Consolas" w:cs="Courier New"/>
@@ -24787,6 +25604,7 @@
         </w:rPr>
         <w:t xml:space="preserve">        </w:t>
       </w:r>
+      <w:proofErr w:type="gramStart"/>
       <w:r>
         <w:rPr>
           <w:rFonts w:ascii="Consolas" w:hAnsi="Consolas" w:cs="Courier New"/>
@@ -24798,6 +25616,7 @@
         </w:rPr>
         <w:t>return</w:t>
       </w:r>
+      <w:proofErr w:type="gramEnd"/>
       <w:r>
         <w:rPr>
           <w:rFonts w:ascii="Consolas" w:hAnsi="Consolas" w:cs="Courier New"/>
@@ -24836,7 +25655,31 @@
           <w:highlight w:val="white"/>
           <w:lang w:val="en-US"/>
         </w:rPr>
-        <w:t xml:space="preserve">            .Select(m =&gt; m.Value.ToLower())</w:t>
+        <w:t xml:space="preserve">            .</w:t>
+      </w:r>
+      <w:proofErr w:type="gramStart"/>
+      <w:r>
+        <w:rPr>
+          <w:rFonts w:ascii="Consolas" w:hAnsi="Consolas" w:cs="Courier New"/>
+          <w:color w:val="000000"/>
+          <w:sz w:val="18"/>
+          <w:szCs w:val="18"/>
+          <w:highlight w:val="white"/>
+          <w:lang w:val="en-US"/>
+        </w:rPr>
+        <w:t>Select(</w:t>
+      </w:r>
+      <w:proofErr w:type="gramEnd"/>
+      <w:r>
+        <w:rPr>
+          <w:rFonts w:ascii="Consolas" w:hAnsi="Consolas" w:cs="Courier New"/>
+          <w:color w:val="000000"/>
+          <w:sz w:val="18"/>
+          <w:szCs w:val="18"/>
+          <w:highlight w:val="white"/>
+          <w:lang w:val="en-US"/>
+        </w:rPr>
+        <w:t>m =&gt; m.Value.ToLower())</w:t>
       </w:r>
     </w:p>
     <w:p>
@@ -24865,7 +25708,31 @@
           <w:highlight w:val="white"/>
           <w:lang w:val="en-US"/>
         </w:rPr>
-        <w:t xml:space="preserve">            .Where(w =&gt; !ignoredWords.Contains(w));</w:t>
+        <w:t xml:space="preserve">            .</w:t>
+      </w:r>
+      <w:proofErr w:type="gramStart"/>
+      <w:r>
+        <w:rPr>
+          <w:rFonts w:ascii="Consolas" w:hAnsi="Consolas" w:cs="Courier New"/>
+          <w:color w:val="000000"/>
+          <w:sz w:val="18"/>
+          <w:szCs w:val="18"/>
+          <w:highlight w:val="white"/>
+          <w:lang w:val="en-US"/>
+        </w:rPr>
+        <w:t>Where(</w:t>
+      </w:r>
+      <w:proofErr w:type="gramEnd"/>
+      <w:r>
+        <w:rPr>
+          <w:rFonts w:ascii="Consolas" w:hAnsi="Consolas" w:cs="Courier New"/>
+          <w:color w:val="000000"/>
+          <w:sz w:val="18"/>
+          <w:szCs w:val="18"/>
+          <w:highlight w:val="white"/>
+          <w:lang w:val="en-US"/>
+        </w:rPr>
+        <w:t>w =&gt; !ignoredWords.Contains(w));</w:t>
       </w:r>
     </w:p>
     <w:p>
@@ -24943,6 +25810,7 @@
         </w:rPr>
         <w:t xml:space="preserve">    </w:t>
       </w:r>
+      <w:proofErr w:type="gramStart"/>
       <w:r>
         <w:rPr>
           <w:rFonts w:ascii="Consolas" w:hAnsi="Consolas" w:cs="Courier New"/>
@@ -24954,6 +25822,7 @@
         </w:rPr>
         <w:t>private</w:t>
       </w:r>
+      <w:proofErr w:type="gramEnd"/>
       <w:r>
         <w:rPr>
           <w:rFonts w:ascii="Consolas" w:hAnsi="Consolas" w:cs="Courier New"/>
@@ -25221,6 +26090,7 @@
         </w:rPr>
         <w:t xml:space="preserve">        </w:t>
       </w:r>
+      <w:proofErr w:type="gramStart"/>
       <w:r>
         <w:rPr>
           <w:rFonts w:ascii="Consolas" w:hAnsi="Consolas" w:cs="Courier New"/>
@@ -25232,6 +26102,7 @@
         </w:rPr>
         <w:t>return</w:t>
       </w:r>
+      <w:proofErr w:type="gramEnd"/>
       <w:r>
         <w:rPr>
           <w:rFonts w:ascii="Consolas" w:hAnsi="Consolas" w:cs="Courier New"/>
@@ -25270,7 +26141,31 @@
           <w:highlight w:val="white"/>
           <w:lang w:val="en-US"/>
         </w:rPr>
-        <w:t xml:space="preserve">            .OrderByDescending(pair =&gt; pair.Value)</w:t>
+        <w:t xml:space="preserve">            .</w:t>
+      </w:r>
+      <w:proofErr w:type="gramStart"/>
+      <w:r>
+        <w:rPr>
+          <w:rFonts w:ascii="Consolas" w:hAnsi="Consolas" w:cs="Courier New"/>
+          <w:color w:val="000000"/>
+          <w:sz w:val="18"/>
+          <w:szCs w:val="18"/>
+          <w:highlight w:val="white"/>
+          <w:lang w:val="en-US"/>
+        </w:rPr>
+        <w:t>OrderByDescending(</w:t>
+      </w:r>
+      <w:proofErr w:type="gramEnd"/>
+      <w:r>
+        <w:rPr>
+          <w:rFonts w:ascii="Consolas" w:hAnsi="Consolas" w:cs="Courier New"/>
+          <w:color w:val="000000"/>
+          <w:sz w:val="18"/>
+          <w:szCs w:val="18"/>
+          <w:highlight w:val="white"/>
+          <w:lang w:val="en-US"/>
+        </w:rPr>
+        <w:t>pair =&gt; pair.Value)</w:t>
       </w:r>
     </w:p>
     <w:p>
@@ -25299,7 +26194,31 @@
           <w:highlight w:val="white"/>
           <w:lang w:val="en-US"/>
         </w:rPr>
-        <w:t xml:space="preserve">            .Take(count)</w:t>
+        <w:t xml:space="preserve">            .</w:t>
+      </w:r>
+      <w:proofErr w:type="gramStart"/>
+      <w:r>
+        <w:rPr>
+          <w:rFonts w:ascii="Consolas" w:hAnsi="Consolas" w:cs="Courier New"/>
+          <w:color w:val="000000"/>
+          <w:sz w:val="18"/>
+          <w:szCs w:val="18"/>
+          <w:highlight w:val="white"/>
+          <w:lang w:val="en-US"/>
+        </w:rPr>
+        <w:t>Take(</w:t>
+      </w:r>
+      <w:proofErr w:type="gramEnd"/>
+      <w:r>
+        <w:rPr>
+          <w:rFonts w:ascii="Consolas" w:hAnsi="Consolas" w:cs="Courier New"/>
+          <w:color w:val="000000"/>
+          <w:sz w:val="18"/>
+          <w:szCs w:val="18"/>
+          <w:highlight w:val="white"/>
+          <w:lang w:val="en-US"/>
+        </w:rPr>
+        <w:t>count)</w:t>
       </w:r>
     </w:p>
     <w:p>
@@ -25328,7 +26247,31 @@
           <w:highlight w:val="white"/>
           <w:lang w:val="en-US"/>
         </w:rPr>
-        <w:t xml:space="preserve">            .ToList();</w:t>
+        <w:t xml:space="preserve">            .</w:t>
+      </w:r>
+      <w:proofErr w:type="gramStart"/>
+      <w:r>
+        <w:rPr>
+          <w:rFonts w:ascii="Consolas" w:hAnsi="Consolas" w:cs="Courier New"/>
+          <w:color w:val="000000"/>
+          <w:sz w:val="18"/>
+          <w:szCs w:val="18"/>
+          <w:highlight w:val="white"/>
+          <w:lang w:val="en-US"/>
+        </w:rPr>
+        <w:t>ToList(</w:t>
+      </w:r>
+      <w:proofErr w:type="gramEnd"/>
+      <w:r>
+        <w:rPr>
+          <w:rFonts w:ascii="Consolas" w:hAnsi="Consolas" w:cs="Courier New"/>
+          <w:color w:val="000000"/>
+          <w:sz w:val="18"/>
+          <w:szCs w:val="18"/>
+          <w:highlight w:val="white"/>
+          <w:lang w:val="en-US"/>
+        </w:rPr>
+        <w:t>);</w:t>
       </w:r>
     </w:p>
     <w:p>
@@ -25406,6 +26349,7 @@
         </w:rPr>
         <w:t xml:space="preserve">    </w:t>
       </w:r>
+      <w:proofErr w:type="gramStart"/>
       <w:r>
         <w:rPr>
           <w:rFonts w:ascii="Consolas" w:hAnsi="Consolas" w:cs="Courier New"/>
@@ -25417,6 +26361,7 @@
         </w:rPr>
         <w:t>public</w:t>
       </w:r>
+      <w:proofErr w:type="gramEnd"/>
       <w:r>
         <w:rPr>
           <w:rFonts w:ascii="Consolas" w:hAnsi="Consolas" w:cs="Courier New"/>
@@ -25607,6 +26552,7 @@
         </w:rPr>
         <w:t xml:space="preserve">        </w:t>
       </w:r>
+      <w:proofErr w:type="gramStart"/>
       <w:r>
         <w:rPr>
           <w:rFonts w:ascii="Consolas" w:hAnsi="Consolas" w:cs="Courier New"/>
@@ -25618,6 +26564,7 @@
         </w:rPr>
         <w:t>return</w:t>
       </w:r>
+      <w:proofErr w:type="gramEnd"/>
       <w:r>
         <w:rPr>
           <w:rFonts w:ascii="Consolas" w:hAnsi="Consolas" w:cs="Courier New"/>
@@ -26255,7 +27202,39 @@
           <w:sz w:val="22"/>
           <w:szCs w:val="22"/>
         </w:rPr>
-        <w:t>Биллиг, В. A. Основы объектного программирования на С# (C# 3.0, Visual Studio 2008) [Электронный ресурс] : учебное пособие / В. A. Биллиг. — Электрон. текстовые данные. — Москва, Саратов : Интернет-Университет Информационных Технологий (ИНТУИТ), Вузовское образование, 2017. — 583 c. — 978-5-4487-0145-0. — Режим доступа: http://www.iprbookshop.ru/72339.html</w:t>
+        <w:t>Биллиг, В. A. Основы объектного программирования на С# (C# 3.0, Visual Studio 2008) [Электронный ресурс</w:t>
+      </w:r>
+      <w:proofErr w:type="gramStart"/>
+      <w:r>
+        <w:rPr>
+          <w:sz w:val="22"/>
+          <w:szCs w:val="22"/>
+        </w:rPr>
+        <w:t>] :</w:t>
+      </w:r>
+      <w:proofErr w:type="gramEnd"/>
+      <w:r>
+        <w:rPr>
+          <w:sz w:val="22"/>
+          <w:szCs w:val="22"/>
+        </w:rPr>
+        <w:t xml:space="preserve"> учебное пособие / В. A. Биллиг. — Электрон. текстовые данные. — Москва, </w:t>
+      </w:r>
+      <w:proofErr w:type="gramStart"/>
+      <w:r>
+        <w:rPr>
+          <w:sz w:val="22"/>
+          <w:szCs w:val="22"/>
+        </w:rPr>
+        <w:t>Саратов :</w:t>
+      </w:r>
+      <w:proofErr w:type="gramEnd"/>
+      <w:r>
+        <w:rPr>
+          <w:sz w:val="22"/>
+          <w:szCs w:val="22"/>
+        </w:rPr>
+        <w:t xml:space="preserve"> Интернет-Университет Информационных Технологий (ИНТУИТ), Вузовское образование, 2017. — 583 c. — 978-5-4487-0145-0. — Режим доступа: http://www.iprbookshop.ru/72339.html</w:t>
       </w:r>
     </w:p>
     <w:p>
@@ -26276,7 +27255,23 @@
           <w:sz w:val="22"/>
           <w:szCs w:val="22"/>
         </w:rPr>
-        <w:t>Павловская, Т. А. Программирование на языке высокого уровня C# [Электронный ресурс] / Т. А. Павловская. — 2-е изд. — Электрон. текстовые данные. — М. : Интернет-Университет Информационных Технологий (ИНТУИТ), 2016. — 245 c. — 2227-8397. — Режим доступа: http://www.iprbookshop.ru/73713.html</w:t>
+        <w:t xml:space="preserve">Павловская, Т. А. Программирование на языке высокого уровня C# [Электронный ресурс] / Т. А. Павловская. — 2-е изд. — Электрон. текстовые данные. — </w:t>
+      </w:r>
+      <w:proofErr w:type="gramStart"/>
+      <w:r>
+        <w:rPr>
+          <w:sz w:val="22"/>
+          <w:szCs w:val="22"/>
+        </w:rPr>
+        <w:t>М. :</w:t>
+      </w:r>
+      <w:proofErr w:type="gramEnd"/>
+      <w:r>
+        <w:rPr>
+          <w:sz w:val="22"/>
+          <w:szCs w:val="22"/>
+        </w:rPr>
+        <w:t xml:space="preserve"> Интернет-Университет Информационных Технологий (ИНТУИТ), 2016. — 245 c. — 2227-8397. — Режим доступа: http://www.iprbookshop.ru/73713.html</w:t>
       </w:r>
     </w:p>
     <w:p>
@@ -26297,7 +27292,39 @@
           <w:sz w:val="22"/>
           <w:szCs w:val="22"/>
         </w:rPr>
-        <w:t>Агапов, В. П. Основы программирования на языке С# [Электронный ресурс] : учебное пособие / В. П. Агапов. — Электрон. текстовые данные. — М. : Московский государственный строительный университет, ЭБС АСВ, 2012. — 128 c. — 978-5-7264-0576-6. — Режим доступа: http://www.iprbookshop.ru/16366.html</w:t>
+        <w:t>Агапов, В. П. Основы программирования на языке С# [Электронный ресурс</w:t>
+      </w:r>
+      <w:proofErr w:type="gramStart"/>
+      <w:r>
+        <w:rPr>
+          <w:sz w:val="22"/>
+          <w:szCs w:val="22"/>
+        </w:rPr>
+        <w:t>] :</w:t>
+      </w:r>
+      <w:proofErr w:type="gramEnd"/>
+      <w:r>
+        <w:rPr>
+          <w:sz w:val="22"/>
+          <w:szCs w:val="22"/>
+        </w:rPr>
+        <w:t xml:space="preserve"> учебное пособие / В. П. Агапов. — Электрон. текстовые данные. — </w:t>
+      </w:r>
+      <w:proofErr w:type="gramStart"/>
+      <w:r>
+        <w:rPr>
+          <w:sz w:val="22"/>
+          <w:szCs w:val="22"/>
+        </w:rPr>
+        <w:t>М. :</w:t>
+      </w:r>
+      <w:proofErr w:type="gramEnd"/>
+      <w:r>
+        <w:rPr>
+          <w:sz w:val="22"/>
+          <w:szCs w:val="22"/>
+        </w:rPr>
+        <w:t xml:space="preserve"> Московский государственный строительный университет, ЭБС АСВ, 2012. — 128 c. — 978-5-7264-0576-6. — Режим доступа: http://www.iprbookshop.ru/16366.html</w:t>
       </w:r>
     </w:p>
     <w:p>
@@ -26318,7 +27345,39 @@
           <w:sz w:val="22"/>
           <w:szCs w:val="22"/>
         </w:rPr>
-        <w:t>Медведев, М. А. Программирование на СИ# [Электронный ресурс] : учебное пособие / М. А. Медведев, А. Н. Медведев ; под ред. А. В. Присяжный. — Электрон. текстовые данные. — Екатеринбург : Уральский федеральный университет, ЭБС АСВ, 2015. — 64 c. — 978-5-7996-1561-1. — Режим доступа: http://www.iprbookshop.ru/69667.html</w:t>
+        <w:t>Медведев, М. А. Программирование на СИ# [Электронный ресурс</w:t>
+      </w:r>
+      <w:proofErr w:type="gramStart"/>
+      <w:r>
+        <w:rPr>
+          <w:sz w:val="22"/>
+          <w:szCs w:val="22"/>
+        </w:rPr>
+        <w:t>] :</w:t>
+      </w:r>
+      <w:proofErr w:type="gramEnd"/>
+      <w:r>
+        <w:rPr>
+          <w:sz w:val="22"/>
+          <w:szCs w:val="22"/>
+        </w:rPr>
+        <w:t xml:space="preserve"> учебное пособие / М. А. Медведев, А. Н. Медведев ; под ред. А. В. Присяжный. — Электрон. текстовые данные. — </w:t>
+      </w:r>
+      <w:proofErr w:type="gramStart"/>
+      <w:r>
+        <w:rPr>
+          <w:sz w:val="22"/>
+          <w:szCs w:val="22"/>
+        </w:rPr>
+        <w:t>Екатеринбург :</w:t>
+      </w:r>
+      <w:proofErr w:type="gramEnd"/>
+      <w:r>
+        <w:rPr>
+          <w:sz w:val="22"/>
+          <w:szCs w:val="22"/>
+        </w:rPr>
+        <w:t xml:space="preserve"> Уральский федеральный университет, ЭБС АСВ, 2015. — 64 c. — 978-5-7996-1561-1. — Режим доступа: http://www.iprbookshop.ru/69667.html</w:t>
       </w:r>
     </w:p>
     <w:p>
@@ -26339,7 +27398,23 @@
           <w:sz w:val="22"/>
           <w:szCs w:val="22"/>
         </w:rPr>
-        <w:t>Казанский А.А. Объектно-ориентированное программирование на языке Microsoft Visual С# в среде разработки Microsoft Visual Studio 2008 и .NET Framework. 4.3 [Электронный ресурс]: учебное пособие и практикум/ Казанский А.А.— Электрон. текстовые данные.— М.: Московский государственный строительный университет, ЭБС АСВ, 2011.— 180 c</w:t>
+        <w:t xml:space="preserve">Казанский А.А. Объектно-ориентированное программирование на языке Microsoft Visual С# в среде разработки Microsoft Visual Studio 2008 и .NET Framework. 4.3 [Электронный ресурс]: учебное пособие и практикум/ Казанский А.А.— Электрон. текстовые </w:t>
+      </w:r>
+      <w:proofErr w:type="gramStart"/>
+      <w:r>
+        <w:rPr>
+          <w:sz w:val="22"/>
+          <w:szCs w:val="22"/>
+        </w:rPr>
+        <w:t>данные.—</w:t>
+      </w:r>
+      <w:proofErr w:type="gramEnd"/>
+      <w:r>
+        <w:rPr>
+          <w:sz w:val="22"/>
+          <w:szCs w:val="22"/>
+        </w:rPr>
+        <w:t xml:space="preserve"> М.: Московский государственный строительный университет, ЭБС АСВ, 2011.— 180 c</w:t>
       </w:r>
     </w:p>
     <w:p>
@@ -26361,7 +27436,23 @@
           <w:szCs w:val="22"/>
         </w:rPr>
         <w:lastRenderedPageBreak/>
-        <w:t>Уйманова Н.А. Основы объектно-ориентированного программирования [Электронный ресурс]: практикум/ Уйманова Н.А., Таспаева М.Г.— Электрон. текстовые данные.— Оренбург: Оренбургский государственный университет, ЭБС АСВ, 2017.— 156 c.— Режим доступа: http://www.iprbookshop.ru/78808.html.— ЭБС «IPRbooks»</w:t>
+        <w:t xml:space="preserve">Уйманова Н.А. Основы объектно-ориентированного программирования [Электронный ресурс]: практикум/ Уйманова Н.А., Таспаева М.Г.— Электрон. текстовые </w:t>
+      </w:r>
+      <w:proofErr w:type="gramStart"/>
+      <w:r>
+        <w:rPr>
+          <w:sz w:val="22"/>
+          <w:szCs w:val="22"/>
+        </w:rPr>
+        <w:t>данные.—</w:t>
+      </w:r>
+      <w:proofErr w:type="gramEnd"/>
+      <w:r>
+        <w:rPr>
+          <w:sz w:val="22"/>
+          <w:szCs w:val="22"/>
+        </w:rPr>
+        <w:t xml:space="preserve"> Оренбург: Оренбургский государственный университет, ЭБС АСВ, 2017.— 156 c.— Режим доступа: http://www.iprbookshop.ru/78808.html.— ЭБС «IPRbooks»</w:t>
       </w:r>
     </w:p>
     <w:p>
@@ -26382,7 +27473,23 @@
           <w:sz w:val="22"/>
           <w:szCs w:val="22"/>
         </w:rPr>
-        <w:t>Новиков П.В. Объектно-ориентированное программирование [Электронный ресурс]: учебно-методическое пособие к лабораторным работам/ Новиков П.В.— Электрон. текстовые данные.— Саратов: Вузовское образование, 2017.— 124 c.— Режим доступа: http://www.iprbookshop.ru/64650.html.— ЭБС «IPRbooks»</w:t>
+        <w:t xml:space="preserve">Новиков П.В. Объектно-ориентированное программирование [Электронный ресурс]: учебно-методическое пособие к лабораторным работам/ Новиков П.В.— Электрон. текстовые </w:t>
+      </w:r>
+      <w:proofErr w:type="gramStart"/>
+      <w:r>
+        <w:rPr>
+          <w:sz w:val="22"/>
+          <w:szCs w:val="22"/>
+        </w:rPr>
+        <w:t>данные.—</w:t>
+      </w:r>
+      <w:proofErr w:type="gramEnd"/>
+      <w:r>
+        <w:rPr>
+          <w:sz w:val="22"/>
+          <w:szCs w:val="22"/>
+        </w:rPr>
+        <w:t xml:space="preserve"> Саратов: Вузовское образование, 2017.— 124 c.— Режим доступа: http://www.iprbookshop.ru/64650.html.— ЭБС «IPRbooks»</w:t>
       </w:r>
     </w:p>
     <w:p/>
@@ -26401,7 +27508,7 @@
 </file>
 
 <file path=word/endnotes.xml><?xml version="1.0" encoding="utf-8"?>
-<w:endnotes xmlns:wpc="http://schemas.microsoft.com/office/word/2010/wordprocessingCanvas" xmlns:cx="http://schemas.microsoft.com/office/drawing/2014/chartex" xmlns:mc="http://schemas.openxmlformats.org/markup-compatibility/2006" xmlns:o="urn:schemas-microsoft-com:office:office" xmlns:r="http://schemas.openxmlformats.org/officeDocument/2006/relationships" xmlns:m="http://schemas.openxmlformats.org/officeDocument/2006/math" xmlns:v="urn:schemas-microsoft-com:vml" xmlns:wp14="http://schemas.microsoft.com/office/word/2010/wordprocessingDrawing" xmlns:wp="http://schemas.openxmlformats.org/drawingml/2006/wordprocessingDrawing" xmlns:w10="urn:schemas-microsoft-com:office:word" xmlns:w="http://schemas.openxmlformats.org/wordprocessingml/2006/main" xmlns:w14="http://schemas.microsoft.com/office/word/2010/wordml" xmlns:w15="http://schemas.microsoft.com/office/word/2012/wordml" xmlns:w16se="http://schemas.microsoft.com/office/word/2015/wordml/symex" xmlns:wpg="http://schemas.microsoft.com/office/word/2010/wordprocessingGroup" xmlns:wpi="http://schemas.microsoft.com/office/word/2010/wordprocessingInk" xmlns:wne="http://schemas.microsoft.com/office/word/2006/wordml" xmlns:wps="http://schemas.microsoft.com/office/word/2010/wordprocessingShape" mc:Ignorable="w14 w15 w16se wp14">
+<w:endnotes xmlns:wpc="http://schemas.microsoft.com/office/word/2010/wordprocessingCanvas" xmlns:mc="http://schemas.openxmlformats.org/markup-compatibility/2006" xmlns:o="urn:schemas-microsoft-com:office:office" xmlns:r="http://schemas.openxmlformats.org/officeDocument/2006/relationships" xmlns:m="http://schemas.openxmlformats.org/officeDocument/2006/math" xmlns:v="urn:schemas-microsoft-com:vml" xmlns:wp14="http://schemas.microsoft.com/office/word/2010/wordprocessingDrawing" xmlns:wp="http://schemas.openxmlformats.org/drawingml/2006/wordprocessingDrawing" xmlns:w10="urn:schemas-microsoft-com:office:word" xmlns:w="http://schemas.openxmlformats.org/wordprocessingml/2006/main" xmlns:w14="http://schemas.microsoft.com/office/word/2010/wordml" xmlns:w15="http://schemas.microsoft.com/office/word/2012/wordml" xmlns:wpg="http://schemas.microsoft.com/office/word/2010/wordprocessingGroup" xmlns:wpi="http://schemas.microsoft.com/office/word/2010/wordprocessingInk" xmlns:wne="http://schemas.microsoft.com/office/word/2006/wordml" xmlns:wps="http://schemas.microsoft.com/office/word/2010/wordprocessingShape" mc:Ignorable="w14 w15 wp14">
   <w:endnote w:type="separator" w:id="-1">
     <w:p>
       <w:r>
@@ -26420,7 +27527,7 @@
 </file>
 
 <file path=word/footer1.xml><?xml version="1.0" encoding="utf-8"?>
-<w:ftr xmlns:wpc="http://schemas.microsoft.com/office/word/2010/wordprocessingCanvas" xmlns:cx="http://schemas.microsoft.com/office/drawing/2014/chartex" xmlns:mc="http://schemas.openxmlformats.org/markup-compatibility/2006" xmlns:o="urn:schemas-microsoft-com:office:office" xmlns:r="http://schemas.openxmlformats.org/officeDocument/2006/relationships" xmlns:m="http://schemas.openxmlformats.org/officeDocument/2006/math" xmlns:v="urn:schemas-microsoft-com:vml" xmlns:wp14="http://schemas.microsoft.com/office/word/2010/wordprocessingDrawing" xmlns:wp="http://schemas.openxmlformats.org/drawingml/2006/wordprocessingDrawing" xmlns:w10="urn:schemas-microsoft-com:office:word" xmlns:w="http://schemas.openxmlformats.org/wordprocessingml/2006/main" xmlns:w14="http://schemas.microsoft.com/office/word/2010/wordml" xmlns:w15="http://schemas.microsoft.com/office/word/2012/wordml" xmlns:w16se="http://schemas.microsoft.com/office/word/2015/wordml/symex" xmlns:wpg="http://schemas.microsoft.com/office/word/2010/wordprocessingGroup" xmlns:wpi="http://schemas.microsoft.com/office/word/2010/wordprocessingInk" xmlns:wne="http://schemas.microsoft.com/office/word/2006/wordml" xmlns:wps="http://schemas.microsoft.com/office/word/2010/wordprocessingShape" mc:Ignorable="w14 w15 w16se wp14">
+<w:ftr xmlns:wpc="http://schemas.microsoft.com/office/word/2010/wordprocessingCanvas" xmlns:mc="http://schemas.openxmlformats.org/markup-compatibility/2006" xmlns:o="urn:schemas-microsoft-com:office:office" xmlns:r="http://schemas.openxmlformats.org/officeDocument/2006/relationships" xmlns:m="http://schemas.openxmlformats.org/officeDocument/2006/math" xmlns:v="urn:schemas-microsoft-com:vml" xmlns:wp14="http://schemas.microsoft.com/office/word/2010/wordprocessingDrawing" xmlns:wp="http://schemas.openxmlformats.org/drawingml/2006/wordprocessingDrawing" xmlns:w10="urn:schemas-microsoft-com:office:word" xmlns:w="http://schemas.openxmlformats.org/wordprocessingml/2006/main" xmlns:w14="http://schemas.microsoft.com/office/word/2010/wordml" xmlns:w15="http://schemas.microsoft.com/office/word/2012/wordml" xmlns:wpg="http://schemas.microsoft.com/office/word/2010/wordprocessingGroup" xmlns:wpi="http://schemas.microsoft.com/office/word/2010/wordprocessingInk" xmlns:wne="http://schemas.microsoft.com/office/word/2006/wordml" xmlns:wps="http://schemas.microsoft.com/office/word/2010/wordprocessingShape" mc:Ignorable="w14 w15 wp14">
   <w:p>
     <w:pPr>
       <w:pStyle w:val="a8"/>
@@ -26454,7 +27561,7 @@
 </file>
 
 <file path=word/footnotes.xml><?xml version="1.0" encoding="utf-8"?>
-<w:footnotes xmlns:wpc="http://schemas.microsoft.com/office/word/2010/wordprocessingCanvas" xmlns:cx="http://schemas.microsoft.com/office/drawing/2014/chartex" xmlns:mc="http://schemas.openxmlformats.org/markup-compatibility/2006" xmlns:o="urn:schemas-microsoft-com:office:office" xmlns:r="http://schemas.openxmlformats.org/officeDocument/2006/relationships" xmlns:m="http://schemas.openxmlformats.org/officeDocument/2006/math" xmlns:v="urn:schemas-microsoft-com:vml" xmlns:wp14="http://schemas.microsoft.com/office/word/2010/wordprocessingDrawing" xmlns:wp="http://schemas.openxmlformats.org/drawingml/2006/wordprocessingDrawing" xmlns:w10="urn:schemas-microsoft-com:office:word" xmlns:w="http://schemas.openxmlformats.org/wordprocessingml/2006/main" xmlns:w14="http://schemas.microsoft.com/office/word/2010/wordml" xmlns:w15="http://schemas.microsoft.com/office/word/2012/wordml" xmlns:w16se="http://schemas.microsoft.com/office/word/2015/wordml/symex" xmlns:wpg="http://schemas.microsoft.com/office/word/2010/wordprocessingGroup" xmlns:wpi="http://schemas.microsoft.com/office/word/2010/wordprocessingInk" xmlns:wne="http://schemas.microsoft.com/office/word/2006/wordml" xmlns:wps="http://schemas.microsoft.com/office/word/2010/wordprocessingShape" mc:Ignorable="w14 w15 w16se wp14">
+<w:footnotes xmlns:wpc="http://schemas.microsoft.com/office/word/2010/wordprocessingCanvas" xmlns:mc="http://schemas.openxmlformats.org/markup-compatibility/2006" xmlns:o="urn:schemas-microsoft-com:office:office" xmlns:r="http://schemas.openxmlformats.org/officeDocument/2006/relationships" xmlns:m="http://schemas.openxmlformats.org/officeDocument/2006/math" xmlns:v="urn:schemas-microsoft-com:vml" xmlns:wp14="http://schemas.microsoft.com/office/word/2010/wordprocessingDrawing" xmlns:wp="http://schemas.openxmlformats.org/drawingml/2006/wordprocessingDrawing" xmlns:w10="urn:schemas-microsoft-com:office:word" xmlns:w="http://schemas.openxmlformats.org/wordprocessingml/2006/main" xmlns:w14="http://schemas.microsoft.com/office/word/2010/wordml" xmlns:w15="http://schemas.microsoft.com/office/word/2012/wordml" xmlns:wpg="http://schemas.microsoft.com/office/word/2010/wordprocessingGroup" xmlns:wpi="http://schemas.microsoft.com/office/word/2010/wordprocessingInk" xmlns:wne="http://schemas.microsoft.com/office/word/2006/wordml" xmlns:wps="http://schemas.microsoft.com/office/word/2010/wordprocessingShape" mc:Ignorable="w14 w15 wp14">
   <w:footnote w:type="separator" w:id="-1">
     <w:p>
       <w:r>
@@ -26473,8 +27580,8 @@
 </file>
 
 <file path=word/numbering.xml><?xml version="1.0" encoding="utf-8"?>
-<w:numbering xmlns:wpc="http://schemas.microsoft.com/office/word/2010/wordprocessingCanvas" xmlns:cx="http://schemas.microsoft.com/office/drawing/2014/chartex" xmlns:mc="http://schemas.openxmlformats.org/markup-compatibility/2006" xmlns:o="urn:schemas-microsoft-com:office:office" xmlns:r="http://schemas.openxmlformats.org/officeDocument/2006/relationships" xmlns:m="http://schemas.openxmlformats.org/officeDocument/2006/math" xmlns:v="urn:schemas-microsoft-com:vml" xmlns:wp14="http://schemas.microsoft.com/office/word/2010/wordprocessingDrawing" xmlns:wp="http://schemas.openxmlformats.org/drawingml/2006/wordprocessingDrawing" xmlns:w10="urn:schemas-microsoft-com:office:word" xmlns:w="http://schemas.openxmlformats.org/wordprocessingml/2006/main" xmlns:w14="http://schemas.microsoft.com/office/word/2010/wordml" xmlns:w15="http://schemas.microsoft.com/office/word/2012/wordml" xmlns:w16se="http://schemas.microsoft.com/office/word/2015/wordml/symex" xmlns:wpg="http://schemas.microsoft.com/office/word/2010/wordprocessingGroup" xmlns:wpi="http://schemas.microsoft.com/office/word/2010/wordprocessingInk" xmlns:wne="http://schemas.microsoft.com/office/word/2006/wordml" xmlns:wps="http://schemas.microsoft.com/office/word/2010/wordprocessingShape" mc:Ignorable="w14 w15 w16se wp14">
-  <w:abstractNum w:abstractNumId="0" w15:restartNumberingAfterBreak="0">
+<w:numbering xmlns:wpc="http://schemas.microsoft.com/office/word/2010/wordprocessingCanvas" xmlns:mc="http://schemas.openxmlformats.org/markup-compatibility/2006" xmlns:o="urn:schemas-microsoft-com:office:office" xmlns:r="http://schemas.openxmlformats.org/officeDocument/2006/relationships" xmlns:m="http://schemas.openxmlformats.org/officeDocument/2006/math" xmlns:v="urn:schemas-microsoft-com:vml" xmlns:wp14="http://schemas.microsoft.com/office/word/2010/wordprocessingDrawing" xmlns:wp="http://schemas.openxmlformats.org/drawingml/2006/wordprocessingDrawing" xmlns:w10="urn:schemas-microsoft-com:office:word" xmlns:w="http://schemas.openxmlformats.org/wordprocessingml/2006/main" xmlns:w14="http://schemas.microsoft.com/office/word/2010/wordml" xmlns:w15="http://schemas.microsoft.com/office/word/2012/wordml" xmlns:wpg="http://schemas.microsoft.com/office/word/2010/wordprocessingGroup" xmlns:wpi="http://schemas.microsoft.com/office/word/2010/wordprocessingInk" xmlns:wne="http://schemas.microsoft.com/office/word/2006/wordml" xmlns:wps="http://schemas.microsoft.com/office/word/2010/wordprocessingShape" mc:Ignorable="w14 w15 wp14">
+  <w:abstractNum w:abstractNumId="0">
     <w:nsid w:val="FFFFFFFB"/>
     <w:multiLevelType w:val="multilevel"/>
     <w:tmpl w:val="FFFFFFFF"/>
@@ -26543,7 +27650,7 @@
       <w:lvlJc w:val="left"/>
     </w:lvl>
   </w:abstractNum>
-  <w:abstractNum w:abstractNumId="1" w15:restartNumberingAfterBreak="0">
+  <w:abstractNum w:abstractNumId="1">
     <w:nsid w:val="1F390DE0"/>
     <w:multiLevelType w:val="multilevel"/>
     <w:tmpl w:val="691AAC1C"/>
@@ -26659,7 +27766,7 @@
       </w:pPr>
     </w:lvl>
   </w:abstractNum>
-  <w:abstractNum w:abstractNumId="2" w15:restartNumberingAfterBreak="0">
+  <w:abstractNum w:abstractNumId="2">
     <w:nsid w:val="2A217B70"/>
     <w:multiLevelType w:val="hybridMultilevel"/>
     <w:tmpl w:val="E598995E"/>
@@ -26772,7 +27879,7 @@
       </w:rPr>
     </w:lvl>
   </w:abstractNum>
-  <w:abstractNum w:abstractNumId="3" w15:restartNumberingAfterBreak="0">
+  <w:abstractNum w:abstractNumId="3">
     <w:nsid w:val="399A191C"/>
     <w:multiLevelType w:val="hybridMultilevel"/>
     <w:tmpl w:val="E2A8E2C4"/>
@@ -26885,7 +27992,7 @@
       </w:pPr>
     </w:lvl>
   </w:abstractNum>
-  <w:abstractNum w:abstractNumId="4" w15:restartNumberingAfterBreak="0">
+  <w:abstractNum w:abstractNumId="4">
     <w:nsid w:val="4D9B6D42"/>
     <w:multiLevelType w:val="hybridMultilevel"/>
     <w:tmpl w:val="B6D488F8"/>
@@ -26998,7 +28105,7 @@
       </w:rPr>
     </w:lvl>
   </w:abstractNum>
-  <w:abstractNum w:abstractNumId="5" w15:restartNumberingAfterBreak="0">
+  <w:abstractNum w:abstractNumId="5">
     <w:nsid w:val="661B6A77"/>
     <w:multiLevelType w:val="hybridMultilevel"/>
     <w:tmpl w:val="34BC57B4"/>
@@ -27111,7 +28218,7 @@
       </w:rPr>
     </w:lvl>
   </w:abstractNum>
-  <w:abstractNum w:abstractNumId="6" w15:restartNumberingAfterBreak="0">
+  <w:abstractNum w:abstractNumId="6">
     <w:nsid w:val="66EB0E95"/>
     <w:multiLevelType w:val="hybridMultilevel"/>
     <w:tmpl w:val="3B4079D2"/>
@@ -27251,7 +28358,7 @@
       </w:rPr>
     </w:lvl>
   </w:abstractNum>
-  <w:abstractNum w:abstractNumId="7" w15:restartNumberingAfterBreak="0">
+  <w:abstractNum w:abstractNumId="7">
     <w:nsid w:val="769163D8"/>
     <w:multiLevelType w:val="hybridMultilevel"/>
     <w:tmpl w:val="207CC17E"/>
@@ -27364,7 +28471,7 @@
       </w:pPr>
     </w:lvl>
   </w:abstractNum>
-  <w:abstractNum w:abstractNumId="8" w15:restartNumberingAfterBreak="0">
+  <w:abstractNum w:abstractNumId="8">
     <w:nsid w:val="7B540F05"/>
     <w:multiLevelType w:val="hybridMultilevel"/>
     <w:tmpl w:val="E598995E"/>
@@ -27509,7 +28616,7 @@
 </file>
 
 <file path=word/styles.xml><?xml version="1.0" encoding="utf-8"?>
-<w:styles xmlns:mc="http://schemas.openxmlformats.org/markup-compatibility/2006" xmlns:r="http://schemas.openxmlformats.org/officeDocument/2006/relationships" xmlns:w="http://schemas.openxmlformats.org/wordprocessingml/2006/main" xmlns:w14="http://schemas.microsoft.com/office/word/2010/wordml" xmlns:w15="http://schemas.microsoft.com/office/word/2012/wordml" xmlns:w16se="http://schemas.microsoft.com/office/word/2015/wordml/symex" mc:Ignorable="w14 w15 w16se">
+<w:styles xmlns:mc="http://schemas.openxmlformats.org/markup-compatibility/2006" xmlns:r="http://schemas.openxmlformats.org/officeDocument/2006/relationships" xmlns:w="http://schemas.openxmlformats.org/wordprocessingml/2006/main" xmlns:w14="http://schemas.microsoft.com/office/word/2010/wordml" xmlns:w15="http://schemas.microsoft.com/office/word/2012/wordml" mc:Ignorable="w14 w15">
   <w:docDefaults>
     <w:rPrDefault>
       <w:rPr>
@@ -28073,6 +29180,7 @@
     <w:uiPriority w:val="59"/>
     <w:rsid w:val="00F50CEE"/>
     <w:tblPr>
+      <w:tblInd w:w="0" w:type="dxa"/>
       <w:tblBorders>
         <w:top w:val="single" w:sz="4" w:space="0" w:color="auto"/>
         <w:left w:val="single" w:sz="4" w:space="0" w:color="auto"/>
@@ -28081,6 +29189,12 @@
         <w:insideH w:val="single" w:sz="4" w:space="0" w:color="auto"/>
         <w:insideV w:val="single" w:sz="4" w:space="0" w:color="auto"/>
       </w:tblBorders>
+      <w:tblCellMar>
+        <w:top w:w="0" w:type="dxa"/>
+        <w:left w:w="108" w:type="dxa"/>
+        <w:bottom w:w="0" w:type="dxa"/>
+        <w:right w:w="108" w:type="dxa"/>
+      </w:tblCellMar>
     </w:tblPr>
   </w:style>
   <w:style w:type="paragraph" w:customStyle="1" w:styleId="12">
@@ -28717,7 +29831,7 @@
 </file>
 
 <file path=customXml/itemProps1.xml><?xml version="1.0" encoding="utf-8"?>
-<ds:datastoreItem xmlns:ds="http://schemas.openxmlformats.org/officeDocument/2006/customXml" ds:itemID="{77BDD3E3-A80F-4CEE-83B6-92C9D03B506C}">
+<ds:datastoreItem xmlns:ds="http://schemas.openxmlformats.org/officeDocument/2006/customXml" ds:itemID="{CDCE4E51-F563-4174-B9DE-B5F54092F248}">
   <ds:schemaRefs>
     <ds:schemaRef ds:uri="http://schemas.openxmlformats.org/officeDocument/2006/bibliography"/>
   </ds:schemaRefs>

</xml_diff>